<commit_message>
S6 consolidated review: switch king silk sheets owner, credit engine swaps, maintenance-class and focus-list fixes
Co-Authored-By: Claude Opus 5.5 <noreply@anthropic.com>
Claude-Session: https://claude.ai/code/session_01YNgDp4Dr6K8rA49jFuXt44
</commit_message>
<xml_diff>
--- a/satin6_deliverables/Satin6_US_audit_20260929_consolidated_review.docx
+++ b/satin6_deliverables/Satin6_US_audit_20260929_consolidated_review.docx
@@ -203,7 +203,7 @@
         <w:t xml:space="preserve">Six dated tests from 13 Oct</w:t>
       </w:r>
       <w:r>
-        <w:t xml:space="preserve">, about $695, after the Prime and 12 Oct deals:</w:t>
+        <w:t xml:space="preserve">, about $700, after the Prime and 12 Oct deals:</w:t>
       </w:r>
     </w:p>
     <w:p>
@@ -451,7 +451,10 @@
           <w:b/>
           <w:bCs/>
         </w:rPr>
-        <w:t xml:space="preserve">From Review A:</w:t>
+        <w:t xml:space="preserve">The engine's own correct swaps</w:t>
+      </w:r>
+      <w:r>
+        <w:t xml:space="preserve"> (10 of its 86 are King Red → King Black, and 18 in all pass the size and colour rule). They can't load through its loader, so they go in by bulk or console. Six of the ten go to Ivory King instead under Review B's LTSF routing; the other four keep the engine's King Black.</w:t>
       </w:r>
     </w:p>
     <w:p>
@@ -463,7 +466,11 @@
         </w:numPr>
       </w:pPr>
       <w:r>
-        <w:t xml:space="preserve">the other 53 Stone Grey Queen campaigns (0 ad units over 15–28 Sep) move to Queen Black;</w:t>
+        <w:rPr>
+          <w:b/>
+          <w:bCs/>
+        </w:rPr>
+        <w:t xml:space="preserve">From Review A:</w:t>
       </w:r>
     </w:p>
     <w:p>
@@ -475,7 +482,7 @@
         </w:numPr>
       </w:pPr>
       <w:r>
-        <w:t xml:space="preserve">the remaining King Red campaigns move to King Black;</w:t>
+        <w:t xml:space="preserve">the other 53 Stone Grey Queen campaigns (0 ad units over 15–28 Sep) move to Queen Black;</w:t>
       </w:r>
     </w:p>
     <w:p>
@@ -487,6 +494,18 @@
         </w:numPr>
       </w:pPr>
       <w:r>
+        <w:t xml:space="preserve">the remaining King Red campaigns move to King Black;</w:t>
+      </w:r>
+    </w:p>
+    <w:p>
+      <w:pPr>
+        <w:pStyle w:val="ListParagraph"/>
+        <w:numPr>
+          <w:ilvl w:val="1"/>
+          <w:numId w:val="2"/>
+        </w:numPr>
+      </w:pPr>
+      <w:r>
         <w:t xml:space="preserve">the brand term moves off a child with 0 stock.</w:t>
       </w:r>
     </w:p>
@@ -539,6 +558,18 @@
         </w:numPr>
       </w:pPr>
       <w:r>
+        <w:t xml:space="preserve">For the two "king silk sheets" campaigns, Review B's owner is kept: 104969852664268, live on King Black at $2.18 effective. The engine and Review A had picked the other one. It has spent $0 in 14 days, sits on Striped King Blue (0 stock) at $4.95 effective, and its 66-order history came from other keywords. The duplicate target there is paused instead.</w:t>
+      </w:r>
+    </w:p>
+    <w:p>
+      <w:pPr>
+        <w:pStyle w:val="ListParagraph"/>
+        <w:numPr>
+          <w:ilvl w:val="1"/>
+          <w:numId w:val="2"/>
+        </w:numPr>
+      </w:pPr>
+      <w:r>
         <w:t xml:space="preserve">"satin sheets" stays paused until Joseph rules, because S4 ranks #3 on it.</w:t>
       </w:r>
     </w:p>
@@ -747,6 +778,69 @@
       </w:pPr>
       <w:r>
         <w:t xml:space="preserve">S4 and S6 bid against each other.</w:t>
+      </w:r>
+    </w:p>
+    <w:p>
+      <w:pPr>
+        <w:spacing w:after="120"/>
+        <w:ind w:left="360"/>
+      </w:pPr>
+      <w:r>
+        <w:t xml:space="preserve">The run's own engine check agrees on two points. It failed three times, and two of the failures are what this review fixes: the two "RED hero held with no swap row" failures are the red King exacts paused here, and the "base fix lowers the top-of-search price" failure is rows 62/65.</w:t>
+      </w:r>
+    </w:p>
+    <w:p>
+      <w:pPr>
+        <w:pStyle w:val="ListParagraph"/>
+        <w:numPr>
+          <w:ilvl w:val="0"/>
+          <w:numId w:val="3"/>
+        </w:numPr>
+      </w:pPr>
+      <w:r>
+        <w:rPr>
+          <w:b/>
+          <w:bCs/>
+        </w:rPr>
+        <w:t xml:space="preserve">Two root causes sit in settings, not in the pricing code:</w:t>
+      </w:r>
+    </w:p>
+    <w:p>
+      <w:pPr>
+        <w:pStyle w:val="ListParagraph"/>
+        <w:numPr>
+          <w:ilvl w:val="1"/>
+          <w:numId w:val="2"/>
+        </w:numPr>
+      </w:pPr>
+      <w:r>
+        <w:rPr>
+          <w:b/>
+          <w:bCs/>
+        </w:rPr>
+        <w:t xml:space="preserve">The ranking-term cuts both reviews reject</w:t>
+      </w:r>
+      <w:r>
+        <w:t xml:space="preserve"> come from the "Maintenance Profit Control" canvas, class HARD (operator 2026-09-24/25, "−25% off the top-of-search price"). So does the budget halving on "king size silk sheet set". The fix is to the maintenance class, or the next run will make the same cuts.</w:t>
+      </w:r>
+    </w:p>
+    <w:p>
+      <w:pPr>
+        <w:pStyle w:val="ListParagraph"/>
+        <w:numPr>
+          <w:ilvl w:val="1"/>
+          <w:numId w:val="2"/>
+        </w:numPr>
+      </w:pPr>
+      <w:r>
+        <w:rPr>
+          <w:b/>
+          <w:bCs/>
+        </w:rPr>
+        <w:t xml:space="preserve">The S4/S6 conflict is written into the run's focus list.</w:t>
+      </w:r>
+      <w:r>
+        <w:t xml:space="preserve"> S6's focus is Satin, Satin Queen, Satin Full and Satin Twin, which are the groups S4 wins. Silk and King, the groups S6 wins, are left out. The ask for Joseph is to set S6's focus to Silk King and S4's to the Satin and Queen groups (section 6).</w:t>
       </w:r>
     </w:p>
     <w:p>
@@ -1166,7 +1260,7 @@
                 <w:sz w:val="17"/>
                 <w:szCs w:val="17"/>
               </w:rPr>
-              <w:t xml:space="preserve">about $695 once, over 2–7 weeks</w:t>
+              <w:t xml:space="preserve">about $700 once, over 2–7 weeks</w:t>
             </w:r>
           </w:p>
         </w:tc>
@@ -2712,7 +2806,71 @@
         <w:t xml:space="preserve">Queen and sizeless head terms slid while some King terms rose.</w:t>
       </w:r>
       <w:r>
-        <w:t xml:space="preserve"> Both reviews report it.</w:t>
+        <w:t xml:space="preserve"> Both reviews report it. The engine's own rank table shows the same:</w:t>
+      </w:r>
+    </w:p>
+    <w:p>
+      <w:pPr>
+        <w:pStyle w:val="ListParagraph"/>
+        <w:numPr>
+          <w:ilvl w:val="1"/>
+          <w:numId w:val="2"/>
+        </w:numPr>
+      </w:pPr>
+      <w:r>
+        <w:t xml:space="preserve">King terms recovered after the restock: "black satin sheets king" 104 → 21, "black silk sheets king" 142 → 40, "silk sheets king" 79 → 38.</w:t>
+      </w:r>
+    </w:p>
+    <w:p>
+      <w:pPr>
+        <w:pStyle w:val="ListParagraph"/>
+        <w:numPr>
+          <w:ilvl w:val="1"/>
+          <w:numId w:val="2"/>
+        </w:numPr>
+      </w:pPr>
+      <w:r>
+        <w:t xml:space="preserve">Queen and sizeless heads slid: "satin sheets queen size" 37 → 51, "silk sheets full" 62 → 98, "silk sheets" 43 → 70.</w:t>
+      </w:r>
+    </w:p>
+    <w:p>
+      <w:pPr>
+        <w:pStyle w:val="ListParagraph"/>
+        <w:numPr>
+          <w:ilvl w:val="0"/>
+          <w:numId w:val="4"/>
+        </w:numPr>
+      </w:pPr>
+      <w:r>
+        <w:rPr>
+          <w:b/>
+          <w:bCs/>
+        </w:rPr>
+        <w:t xml:space="preserve">The engine's own check sides with both reviews on two failures.</w:t>
+      </w:r>
+    </w:p>
+    <w:p>
+      <w:pPr>
+        <w:pStyle w:val="ListParagraph"/>
+        <w:numPr>
+          <w:ilvl w:val="1"/>
+          <w:numId w:val="2"/>
+        </w:numPr>
+      </w:pPr>
+      <w:r>
+        <w:t xml:space="preserve">The two "RED hero held with no swap row" failures are the red King exacts (2019, 2021) that both reviews take off King Red.</w:t>
+      </w:r>
+    </w:p>
+    <w:p>
+      <w:pPr>
+        <w:pStyle w:val="ListParagraph"/>
+        <w:numPr>
+          <w:ilvl w:val="1"/>
+          <w:numId w:val="2"/>
+        </w:numPr>
+      </w:pPr>
+      <w:r>
+        <w:t xml:space="preserve">The "base fix lowers the top-of-search price" failure is rows 62/65.</w:t>
       </w:r>
     </w:p>
     <w:p>
@@ -4138,7 +4296,7 @@
                 <w:sz w:val="17"/>
                 <w:szCs w:val="17"/>
               </w:rPr>
-              <w:t xml:space="preserve">Pauses: "red satin sheets king", idle red/white King exacts, duplicate "king silk sheets"</w:t>
+              <w:t xml:space="preserve">Pauses: "red satin sheets king" and the idle red/white King exacts</w:t>
             </w:r>
           </w:p>
         </w:tc>
@@ -4242,7 +4400,7 @@
                 <w:sz w:val="17"/>
                 <w:szCs w:val="17"/>
               </w:rPr>
-              <w:t xml:space="preserve">279% ACoS over 15–28 Sep; King Red runs out 8–12 Oct. The duplicate kept is the one with 90 days of history (66 orders), re-pointed to King Black.</w:t>
+              <w:t xml:space="preserve">279% ACoS over 15–28 Sep; King Red runs out 8–12 Oct</w:t>
             </w:r>
           </w:p>
         </w:tc>
@@ -4408,7 +4566,7 @@
                 <w:sz w:val="17"/>
                 <w:szCs w:val="17"/>
               </w:rPr>
-              <w:t xml:space="preserve">"satin sheets" revive</w:t>
+              <w:t xml:space="preserve">Duplicate "king silk sheets" campaigns</w:t>
             </w:r>
           </w:p>
         </w:tc>
@@ -4434,7 +4592,7 @@
                 <w:sz w:val="17"/>
                 <w:szCs w:val="17"/>
               </w:rPr>
-              <w:t xml:space="preserve">Hold; Joseph (S4 ranks #3)</w:t>
+              <w:t xml:space="preserve">Keep 446556169592872 (403 clicks, 66 orders in 90 days) and pause 104969852664268, as the engine did</w:t>
             </w:r>
           </w:p>
         </w:tc>
@@ -4460,7 +4618,7 @@
                 <w:sz w:val="17"/>
                 <w:szCs w:val="17"/>
               </w:rPr>
-              <w:t xml:space="preserve">Enable as a held term</w:t>
+              <w:t xml:space="preserve">Keep 104969852664268; pause the duplicate target in 446556169592872</w:t>
             </w:r>
           </w:p>
         </w:tc>
@@ -4486,7 +4644,7 @@
                 <w:sz w:val="17"/>
                 <w:szCs w:val="17"/>
               </w:rPr>
-              <w:t xml:space="preserve">A</w:t>
+              <w:t xml:space="preserve">B</w:t>
             </w:r>
           </w:p>
         </w:tc>
@@ -4512,7 +4670,7 @@
                 <w:sz w:val="17"/>
                 <w:szCs w:val="17"/>
               </w:rPr>
-              <w:t xml:space="preserve">S4 ownership. S6 already buys the term at 17.6% ACoS through auto and broad.</w:t>
+              <w:t xml:space="preserve">104969852664268 is live on King Black at $1.09 × 200% = $2.18 (35 clicks, 7 orders in 90 days). 446556169592872 spent $0 in 14 days on Striped King Blue (0 stock) at $3.00 × 165% = $4.95, above the Silk bound, and its "king silk sheets" keyword has 20 clicks and 2 orders. Its 66-order history belongs to other keywords on a different child.</w:t>
             </w:r>
           </w:p>
         </w:tc>
@@ -4543,7 +4701,7 @@
                 <w:sz w:val="17"/>
                 <w:szCs w:val="17"/>
               </w:rPr>
-              <w:t xml:space="preserve">"sábanas de seda" revive</w:t>
+              <w:t xml:space="preserve">"satin sheets" revive</w:t>
             </w:r>
           </w:p>
         </w:tc>
@@ -4569,7 +4727,7 @@
                 <w:sz w:val="17"/>
                 <w:szCs w:val="17"/>
               </w:rPr>
-              <w:t xml:space="preserve">Enable after the deals ($0.02 a day)</w:t>
+              <w:t xml:space="preserve">Hold; Joseph (S4 ranks #3)</w:t>
             </w:r>
           </w:p>
         </w:tc>
@@ -4595,7 +4753,7 @@
                 <w:sz w:val="17"/>
                 <w:szCs w:val="17"/>
               </w:rPr>
-              <w:t xml:space="preserve">Keep paused</w:t>
+              <w:t xml:space="preserve">Enable as a held term</w:t>
             </w:r>
           </w:p>
         </w:tc>
@@ -4621,7 +4779,7 @@
                 <w:sz w:val="17"/>
                 <w:szCs w:val="17"/>
               </w:rPr>
-              <w:t xml:space="preserve">B</w:t>
+              <w:t xml:space="preserve">A</w:t>
             </w:r>
           </w:p>
         </w:tc>
@@ -4647,7 +4805,7 @@
                 <w:sz w:val="17"/>
                 <w:szCs w:val="17"/>
               </w:rPr>
-              <w:t xml:space="preserve">Off-core Spanish term; B’s negative rule covers foreign-language terms</w:t>
+              <w:t xml:space="preserve">S4 ownership. S6 already buys the term at 17.6% ACoS through auto and broad.</w:t>
             </w:r>
           </w:p>
         </w:tc>
@@ -4678,7 +4836,7 @@
                 <w:sz w:val="17"/>
                 <w:szCs w:val="17"/>
               </w:rPr>
-              <w:t xml:space="preserve">Negatives and walls</w:t>
+              <w:t xml:space="preserve">"sábanas de seda" revive</w:t>
             </w:r>
           </w:p>
         </w:tc>
@@ -4704,7 +4862,7 @@
                 <w:sz w:val="17"/>
                 <w:szCs w:val="17"/>
               </w:rPr>
-              <w:t xml:space="preserve">Hold the engine’s 7 walls on converting terms</w:t>
+              <w:t xml:space="preserve">Enable after the deals ($0.02 a day)</w:t>
             </w:r>
           </w:p>
         </w:tc>
@@ -4730,7 +4888,7 @@
                 <w:sz w:val="17"/>
                 <w:szCs w:val="17"/>
               </w:rPr>
-              <w:t xml:space="preserve">Its own itemised list: zero-order terms (p &lt; 5%), other-product and foreign-language terms, harvest isolation</w:t>
+              <w:t xml:space="preserve">Keep paused</w:t>
             </w:r>
           </w:p>
         </w:tc>
@@ -4756,7 +4914,7 @@
                 <w:sz w:val="17"/>
                 <w:szCs w:val="17"/>
               </w:rPr>
-              <w:t xml:space="preserve">B’s list, minus 10 rows</w:t>
+              <w:t xml:space="preserve">B</w:t>
             </w:r>
           </w:p>
         </w:tc>
@@ -4782,7 +4940,7 @@
                 <w:sz w:val="17"/>
                 <w:szCs w:val="17"/>
               </w:rPr>
-              <w:t xml:space="preserve">B’s list negates only zero-order, other-product, foreign-language and harvested terms. Its bulk file also carries 10 negatives that wall its push terms out of the Auto (16.2% ACoS); those feed a push we don’t make, so they are excluded.</w:t>
+              <w:t xml:space="preserve">Off-core Spanish term; B’s negative rule covers foreign-language terms</w:t>
             </w:r>
           </w:p>
         </w:tc>
@@ -4813,7 +4971,7 @@
                 <w:sz w:val="17"/>
                 <w:szCs w:val="17"/>
               </w:rPr>
-              <w:t xml:space="preserve">New campaigns and tests</w:t>
+              <w:t xml:space="preserve">Negatives and walls</w:t>
             </w:r>
           </w:p>
         </w:tc>
@@ -4839,7 +4997,7 @@
                 <w:sz w:val="17"/>
                 <w:szCs w:val="17"/>
               </w:rPr>
-              <w:t xml:space="preserve">Hold all 13; test on existing exacts after the deals</w:t>
+              <w:t xml:space="preserve">Hold the engine’s 7 walls on converting terms</w:t>
             </w:r>
           </w:p>
         </w:tc>
@@ -4865,7 +5023,7 @@
                 <w:sz w:val="17"/>
                 <w:szCs w:val="17"/>
               </w:rPr>
-              <w:t xml:space="preserve">No builds; harvest 18 terms into existing exacts at source CPC, with isolation negatives</w:t>
+              <w:t xml:space="preserve">Its own itemised list: zero-order terms (p &lt; 5%), other-product and foreign-language terms, harvest isolation</w:t>
             </w:r>
           </w:p>
         </w:tc>
@@ -4891,7 +5049,7 @@
                 <w:sz w:val="17"/>
                 <w:szCs w:val="17"/>
               </w:rPr>
-              <w:t xml:space="preserve">B’s harvest, A’s timing and S4 exclusions</w:t>
+              <w:t xml:space="preserve">B’s list, minus 10 rows</w:t>
             </w:r>
           </w:p>
         </w:tc>
@@ -4917,7 +5075,7 @@
                 <w:sz w:val="17"/>
                 <w:szCs w:val="17"/>
               </w:rPr>
-              <w:t xml:space="preserve">No double bidding. "cooling satin sheets" and "sateen sheets queen size" are excluded as S4’s (the engine’s own ownership check).</w:t>
+              <w:t xml:space="preserve">B’s list negates only zero-order, other-product, foreign-language and harvested terms. Its bulk file also carries 10 negatives that wall its push terms out of the Auto (16.2% ACoS); those feed a push we don’t make, so they are excluded.</w:t>
             </w:r>
           </w:p>
         </w:tc>
@@ -4948,7 +5106,7 @@
                 <w:sz w:val="17"/>
                 <w:szCs w:val="17"/>
               </w:rPr>
-              <w:t xml:space="preserve">Non-ranking King campaigns on King Red</w:t>
+              <w:t xml:space="preserve">New campaigns and tests</w:t>
             </w:r>
           </w:p>
         </w:tc>
@@ -4974,7 +5132,7 @@
                 <w:sz w:val="17"/>
                 <w:szCs w:val="17"/>
               </w:rPr>
-              <w:t xml:space="preserve">Move to King Black</w:t>
+              <w:t xml:space="preserve">Hold all 13; test on existing exacts after the deals</w:t>
             </w:r>
           </w:p>
         </w:tc>
@@ -5000,7 +5158,7 @@
                 <w:sz w:val="17"/>
                 <w:szCs w:val="17"/>
               </w:rPr>
-              <w:t xml:space="preserve">Move 10 to Ivory King (an LTSF colour that converts at least half as well)</w:t>
+              <w:t xml:space="preserve">No builds; harvest 18 terms into existing exacts at source CPC, with isolation negatives</w:t>
             </w:r>
           </w:p>
         </w:tc>
@@ -5026,7 +5184,7 @@
                 <w:sz w:val="17"/>
                 <w:szCs w:val="17"/>
               </w:rPr>
-              <w:t xml:space="preserve">B for its 10; A (King Black) for the rest</w:t>
+              <w:t xml:space="preserve">B’s harvest, A’s timing and S4 exclusions</w:t>
             </w:r>
           </w:p>
         </w:tc>
@@ -5052,7 +5210,7 @@
                 <w:sz w:val="17"/>
                 <w:szCs w:val="17"/>
               </w:rPr>
-              <w:t xml:space="preserve">Clears aged Ivory King stock and keeps King Black for ranking</w:t>
+              <w:t xml:space="preserve">No double bidding. "cooling satin sheets" and "sateen sheets queen size" are excluded as S4’s (the engine’s own ownership check).</w:t>
             </w:r>
           </w:p>
         </w:tc>
@@ -5083,7 +5241,7 @@
                 <w:sz w:val="17"/>
                 <w:szCs w:val="17"/>
               </w:rPr>
-              <w:t xml:space="preserve">Stone Grey Queen campaigns</w:t>
+              <w:t xml:space="preserve">Non-ranking King campaigns on King Red</w:t>
             </w:r>
           </w:p>
         </w:tc>
@@ -5109,7 +5267,7 @@
                 <w:sz w:val="17"/>
                 <w:szCs w:val="17"/>
               </w:rPr>
-              <w:t xml:space="preserve">All 64 to Queen Black</w:t>
+              <w:t xml:space="preserve">Move to King Black</w:t>
             </w:r>
           </w:p>
         </w:tc>
@@ -5135,7 +5293,7 @@
                 <w:sz w:val="17"/>
                 <w:szCs w:val="17"/>
               </w:rPr>
-              <w:t xml:space="preserve">The 11 ranking ones to Queen Black</w:t>
+              <w:t xml:space="preserve">Move 10 to Ivory King (an LTSF colour that converts at least half as well)</w:t>
             </w:r>
           </w:p>
         </w:tc>
@@ -5161,7 +5319,7 @@
                 <w:sz w:val="17"/>
                 <w:szCs w:val="17"/>
               </w:rPr>
-              <w:t xml:space="preserve">A for the other 53</w:t>
+              <w:t xml:space="preserve">B for 6 of the engine’s 10 correct King Red → King Black swaps (Ivory King); the engine’s King Black for the other 4; A for the rest</w:t>
             </w:r>
           </w:p>
         </w:tc>
@@ -5187,7 +5345,7 @@
                 <w:sz w:val="17"/>
                 <w:szCs w:val="17"/>
               </w:rPr>
-              <w:t xml:space="preserve">$51.87 of ad spend for 0 ad units over 15–28 Sep; −$0.41 a unit all-in</w:t>
+              <w:t xml:space="preserve">The engine’s 10 King Red → King Black moves are correct under the size rule, so they are credited, not counted as errors; they go in by bulk/console because the loader skips product ads. Ivory King clears aged stock and keeps King Black for ranking.</w:t>
             </w:r>
           </w:p>
         </w:tc>
@@ -5218,7 +5376,7 @@
                 <w:sz w:val="17"/>
                 <w:szCs w:val="17"/>
               </w:rPr>
-              <w:t xml:space="preserve">Back-up children</w:t>
+              <w:t xml:space="preserve">Stone Grey Queen campaigns</w:t>
             </w:r>
           </w:p>
         </w:tc>
@@ -5244,7 +5402,7 @@
                 <w:sz w:val="17"/>
                 <w:szCs w:val="17"/>
               </w:rPr>
-              <w:t xml:space="preserve">No mechanism</w:t>
+              <w:t xml:space="preserve">All 64 to Queen Black</w:t>
             </w:r>
           </w:p>
         </w:tc>
@@ -5270,7 +5428,7 @@
                 <w:sz w:val="17"/>
                 <w:szCs w:val="17"/>
               </w:rPr>
-              <w:t xml:space="preserve">Back-up ad loaded paused on every ranking campaign; switch under 14 days of stock</w:t>
+              <w:t xml:space="preserve">The 11 ranking ones to Queen Black</w:t>
             </w:r>
           </w:p>
         </w:tc>
@@ -5296,7 +5454,7 @@
                 <w:sz w:val="17"/>
                 <w:szCs w:val="17"/>
               </w:rPr>
-              <w:t xml:space="preserve">B</w:t>
+              <w:t xml:space="preserve">A for the other 53</w:t>
             </w:r>
           </w:p>
         </w:tc>
@@ -5316,7 +5474,15 @@
               <w:right w:type="dxa" w:w="90"/>
             </w:tcMar>
           </w:tcPr>
-          <w:p/>
+          <w:p>
+            <w:r>
+              <w:rPr>
+                <w:sz w:val="17"/>
+                <w:szCs w:val="17"/>
+              </w:rPr>
+              <w:t xml:space="preserve">$51.87 of ad spend for 0 ad units over 15–28 Sep; −$0.41 a unit all-in</w:t>
+            </w:r>
+          </w:p>
         </w:tc>
       </w:tr>
       <w:tr>
@@ -5345,7 +5511,7 @@
                 <w:sz w:val="17"/>
                 <w:szCs w:val="17"/>
               </w:rPr>
-              <w:t xml:space="preserve">Margin basis</w:t>
+              <w:t xml:space="preserve">Back-up children</w:t>
             </w:r>
           </w:p>
         </w:tc>
@@ -5371,7 +5537,7 @@
                 <w:sz w:val="17"/>
                 <w:szCs w:val="17"/>
               </w:rPr>
-              <w:t xml:space="preserve">Sellerboard excluding one-offs for click prices; all-in for profit</w:t>
+              <w:t xml:space="preserve">No mechanism</w:t>
             </w:r>
           </w:p>
         </w:tc>
@@ -5397,7 +5563,7 @@
                 <w:sz w:val="17"/>
                 <w:szCs w:val="17"/>
               </w:rPr>
-              <w:t xml:space="preserve">Sellerboard per child, all-in (e.g. Queen Black 9%)</w:t>
+              <w:t xml:space="preserve">Back-up ad loaded paused on every ranking campaign; switch under 14 days of stock</w:t>
             </w:r>
           </w:p>
         </w:tc>
@@ -5423,7 +5589,7 @@
                 <w:sz w:val="17"/>
                 <w:szCs w:val="17"/>
               </w:rPr>
-              <w:t xml:space="preserve">Per child (B), excluding one-offs for click ceilings (A)</w:t>
+              <w:t xml:space="preserve">B</w:t>
             </w:r>
           </w:p>
         </w:tc>
@@ -5443,15 +5609,7 @@
               <w:right w:type="dxa" w:w="90"/>
             </w:tcMar>
           </w:tcPr>
-          <w:p>
-            <w:r>
-              <w:rPr>
-                <w:sz w:val="17"/>
-                <w:szCs w:val="17"/>
-              </w:rPr>
-              <w:t xml:space="preserve">B’s per-child view is more precise. LTSF and removal fees don’t change with one more click.</w:t>
-            </w:r>
-          </w:p>
+          <w:p/>
         </w:tc>
       </w:tr>
       <w:tr>
@@ -5480,6 +5638,141 @@
                 <w:sz w:val="17"/>
                 <w:szCs w:val="17"/>
               </w:rPr>
+              <w:t xml:space="preserve">Margin basis</w:t>
+            </w:r>
+          </w:p>
+        </w:tc>
+        <w:tc>
+          <w:tcPr>
+            <w:tcW w:type="dxa" w:w="2808"/>
+            <w:tcBorders>
+              <w:top w:val="single" w:color="BFBFBF" w:sz="4"/>
+              <w:left w:val="single" w:color="BFBFBF" w:sz="4"/>
+              <w:bottom w:val="single" w:color="BFBFBF" w:sz="4"/>
+              <w:right w:val="single" w:color="BFBFBF" w:sz="4"/>
+            </w:tcBorders>
+            <w:tcMar>
+              <w:top w:type="dxa" w:w="60"/>
+              <w:left w:type="dxa" w:w="90"/>
+              <w:bottom w:type="dxa" w:w="60"/>
+              <w:right w:type="dxa" w:w="90"/>
+            </w:tcMar>
+          </w:tcPr>
+          <w:p>
+            <w:r>
+              <w:rPr>
+                <w:sz w:val="17"/>
+                <w:szCs w:val="17"/>
+              </w:rPr>
+              <w:t xml:space="preserve">Sellerboard excluding one-offs for click prices; all-in for profit</w:t>
+            </w:r>
+          </w:p>
+        </w:tc>
+        <w:tc>
+          <w:tcPr>
+            <w:tcW w:type="dxa" w:w="2808"/>
+            <w:tcBorders>
+              <w:top w:val="single" w:color="BFBFBF" w:sz="4"/>
+              <w:left w:val="single" w:color="BFBFBF" w:sz="4"/>
+              <w:bottom w:val="single" w:color="BFBFBF" w:sz="4"/>
+              <w:right w:val="single" w:color="BFBFBF" w:sz="4"/>
+            </w:tcBorders>
+            <w:tcMar>
+              <w:top w:type="dxa" w:w="60"/>
+              <w:left w:type="dxa" w:w="90"/>
+              <w:bottom w:type="dxa" w:w="60"/>
+              <w:right w:type="dxa" w:w="90"/>
+            </w:tcMar>
+          </w:tcPr>
+          <w:p>
+            <w:r>
+              <w:rPr>
+                <w:sz w:val="17"/>
+                <w:szCs w:val="17"/>
+              </w:rPr>
+              <w:t xml:space="preserve">Sellerboard per child, all-in (e.g. Queen Black 9%)</w:t>
+            </w:r>
+          </w:p>
+        </w:tc>
+        <w:tc>
+          <w:tcPr>
+            <w:tcW w:type="dxa" w:w="2808"/>
+            <w:tcBorders>
+              <w:top w:val="single" w:color="BFBFBF" w:sz="4"/>
+              <w:left w:val="single" w:color="BFBFBF" w:sz="4"/>
+              <w:bottom w:val="single" w:color="BFBFBF" w:sz="4"/>
+              <w:right w:val="single" w:color="BFBFBF" w:sz="4"/>
+            </w:tcBorders>
+            <w:tcMar>
+              <w:top w:type="dxa" w:w="60"/>
+              <w:left w:type="dxa" w:w="90"/>
+              <w:bottom w:type="dxa" w:w="60"/>
+              <w:right w:type="dxa" w:w="90"/>
+            </w:tcMar>
+          </w:tcPr>
+          <w:p>
+            <w:r>
+              <w:rPr>
+                <w:sz w:val="17"/>
+                <w:szCs w:val="17"/>
+              </w:rPr>
+              <w:t xml:space="preserve">Per child (B), excluding one-offs for click ceilings (A)</w:t>
+            </w:r>
+          </w:p>
+        </w:tc>
+        <w:tc>
+          <w:tcPr>
+            <w:tcW w:type="dxa" w:w="2808"/>
+            <w:tcBorders>
+              <w:top w:val="single" w:color="BFBFBF" w:sz="4"/>
+              <w:left w:val="single" w:color="BFBFBF" w:sz="4"/>
+              <w:bottom w:val="single" w:color="BFBFBF" w:sz="4"/>
+              <w:right w:val="single" w:color="BFBFBF" w:sz="4"/>
+            </w:tcBorders>
+            <w:tcMar>
+              <w:top w:type="dxa" w:w="60"/>
+              <w:left w:type="dxa" w:w="90"/>
+              <w:bottom w:type="dxa" w:w="60"/>
+              <w:right w:type="dxa" w:w="90"/>
+            </w:tcMar>
+          </w:tcPr>
+          <w:p>
+            <w:r>
+              <w:rPr>
+                <w:sz w:val="17"/>
+                <w:szCs w:val="17"/>
+              </w:rPr>
+              <w:t xml:space="preserve">B’s per-child view is more precise. LTSF and removal fees don’t change with one more click.</w:t>
+            </w:r>
+          </w:p>
+        </w:tc>
+      </w:tr>
+      <w:tr>
+        <w:trPr>
+          <w:tblHeader w:val="off"/>
+        </w:trPr>
+        <w:tc>
+          <w:tcPr>
+            <w:tcW w:type="dxa" w:w="2808"/>
+            <w:tcBorders>
+              <w:top w:val="single" w:color="BFBFBF" w:sz="4"/>
+              <w:left w:val="single" w:color="BFBFBF" w:sz="4"/>
+              <w:bottom w:val="single" w:color="BFBFBF" w:sz="4"/>
+              <w:right w:val="single" w:color="BFBFBF" w:sz="4"/>
+            </w:tcBorders>
+            <w:tcMar>
+              <w:top w:type="dxa" w:w="60"/>
+              <w:left w:type="dxa" w:w="90"/>
+              <w:bottom w:type="dxa" w:w="60"/>
+              <w:right w:type="dxa" w:w="90"/>
+            </w:tcMar>
+          </w:tcPr>
+          <w:p>
+            <w:r>
+              <w:rPr>
+                <w:sz w:val="17"/>
+                <w:szCs w:val="17"/>
+              </w:rPr>
               <w:t xml:space="preserve">Engine spend baseline and forecast</w:t>
             </w:r>
           </w:p>
@@ -5506,7 +5799,7 @@
                 <w:sz w:val="17"/>
                 <w:szCs w:val="17"/>
               </w:rPr>
-              <w:t xml:space="preserve">Not S6’s spend ($173 a day read against $88); forecast inflated by the tests</w:t>
+              <w:t xml:space="preserve">Not S6’s spend ($173 a day read against $88); forecast inflated by the tests. The campaign list carries about $30 a day on campaigns with no S6 child, e.g. "BAMBOO-QUEEN-OLIVE SBV EX 220524 - bamboo sheets queen size" ($46.80 in 14 days), "Bamboo - SB - Headline - queen size bamboo sheets" and three Satin Fitted Sponsored Brands campaigns (D-SF, $344).</w:t>
             </w:r>
           </w:p>
         </w:tc>
@@ -6897,6 +7190,21 @@
     </w:p>
     <w:p>
       <w:pPr>
+        <w:spacing w:after="120"/>
+      </w:pPr>
+      <w:r>
+        <w:rPr>
+          <w:b/>
+          <w:bCs/>
+        </w:rPr>
+        <w:t xml:space="preserve">Change the engine's focus list, or the conflict repeats every run.</w:t>
+      </w:r>
+      <w:r>
+        <w:t xml:space="preserve"> This run's focus for S6 is Satin, Satin Queen, Satin Full and Satin Twin, the groups S4 wins, and it excludes Silk and King, the groups S6 wins. So the engine tapers S6's best syntax and concentrates on S4's. Set S6's focus to Silk King (plus the "6 piece" terms), and S4's to the Satin and Queen groups (section 6).</w:t>
+      </w:r>
+    </w:p>
+    <w:p>
+      <w:pPr>
         <w:pStyle w:val="Heading2"/>
       </w:pPr>
       <w:r>
@@ -7481,12 +7789,12 @@
         </w:tblBorders>
       </w:tblPr>
       <w:tblGrid>
-        <w:gridCol w:w="3403"/>
-        <w:gridCol w:w="4041"/>
-        <w:gridCol w:w="1914"/>
-        <w:gridCol w:w="1063"/>
-        <w:gridCol w:w="1701"/>
-        <w:gridCol w:w="1918"/>
+        <w:gridCol w:w="5548"/>
+        <w:gridCol w:w="3278"/>
+        <w:gridCol w:w="1513"/>
+        <w:gridCol w:w="840"/>
+        <w:gridCol w:w="1345"/>
+        <w:gridCol w:w="1516"/>
       </w:tblGrid>
       <w:tr>
         <w:trPr>
@@ -7494,7 +7802,7 @@
         </w:trPr>
         <w:tc>
           <w:tcPr>
-            <w:tcW w:type="dxa" w:w="3403"/>
+            <w:tcW w:type="dxa" w:w="5548"/>
             <w:tcBorders>
               <w:top w:val="single" w:color="BFBFBF" w:sz="4"/>
               <w:left w:val="single" w:color="BFBFBF" w:sz="4"/>
@@ -7524,7 +7832,7 @@
         </w:tc>
         <w:tc>
           <w:tcPr>
-            <w:tcW w:type="dxa" w:w="4041"/>
+            <w:tcW w:type="dxa" w:w="3278"/>
             <w:tcBorders>
               <w:top w:val="single" w:color="BFBFBF" w:sz="4"/>
               <w:left w:val="single" w:color="BFBFBF" w:sz="4"/>
@@ -7554,7 +7862,7 @@
         </w:tc>
         <w:tc>
           <w:tcPr>
-            <w:tcW w:type="dxa" w:w="1914"/>
+            <w:tcW w:type="dxa" w:w="1513"/>
             <w:tcBorders>
               <w:top w:val="single" w:color="BFBFBF" w:sz="4"/>
               <w:left w:val="single" w:color="BFBFBF" w:sz="4"/>
@@ -7584,7 +7892,7 @@
         </w:tc>
         <w:tc>
           <w:tcPr>
-            <w:tcW w:type="dxa" w:w="1063"/>
+            <w:tcW w:type="dxa" w:w="840"/>
             <w:tcBorders>
               <w:top w:val="single" w:color="BFBFBF" w:sz="4"/>
               <w:left w:val="single" w:color="BFBFBF" w:sz="4"/>
@@ -7614,7 +7922,7 @@
         </w:tc>
         <w:tc>
           <w:tcPr>
-            <w:tcW w:type="dxa" w:w="1701"/>
+            <w:tcW w:type="dxa" w:w="1345"/>
             <w:tcBorders>
               <w:top w:val="single" w:color="BFBFBF" w:sz="4"/>
               <w:left w:val="single" w:color="BFBFBF" w:sz="4"/>
@@ -7644,7 +7952,7 @@
         </w:tc>
         <w:tc>
           <w:tcPr>
-            <w:tcW w:type="dxa" w:w="1918"/>
+            <w:tcW w:type="dxa" w:w="1516"/>
             <w:tcBorders>
               <w:top w:val="single" w:color="BFBFBF" w:sz="4"/>
               <w:left w:val="single" w:color="BFBFBF" w:sz="4"/>
@@ -7679,7 +7987,7 @@
         </w:trPr>
         <w:tc>
           <w:tcPr>
-            <w:tcW w:type="dxa" w:w="3403"/>
+            <w:tcW w:type="dxa" w:w="5548"/>
             <w:tcBorders>
               <w:top w:val="single" w:color="BFBFBF" w:sz="4"/>
               <w:left w:val="single" w:color="BFBFBF" w:sz="4"/>
@@ -7705,7 +8013,7 @@
         </w:tc>
         <w:tc>
           <w:tcPr>
-            <w:tcW w:type="dxa" w:w="4041"/>
+            <w:tcW w:type="dxa" w:w="3278"/>
             <w:tcBorders>
               <w:top w:val="single" w:color="BFBFBF" w:sz="4"/>
               <w:left w:val="single" w:color="BFBFBF" w:sz="4"/>
@@ -7731,7 +8039,7 @@
         </w:tc>
         <w:tc>
           <w:tcPr>
-            <w:tcW w:type="dxa" w:w="1914"/>
+            <w:tcW w:type="dxa" w:w="1513"/>
             <w:tcBorders>
               <w:top w:val="single" w:color="BFBFBF" w:sz="4"/>
               <w:left w:val="single" w:color="BFBFBF" w:sz="4"/>
@@ -7757,7 +8065,7 @@
         </w:tc>
         <w:tc>
           <w:tcPr>
-            <w:tcW w:type="dxa" w:w="1063"/>
+            <w:tcW w:type="dxa" w:w="840"/>
             <w:tcBorders>
               <w:top w:val="single" w:color="BFBFBF" w:sz="4"/>
               <w:left w:val="single" w:color="BFBFBF" w:sz="4"/>
@@ -7783,7 +8091,7 @@
         </w:tc>
         <w:tc>
           <w:tcPr>
-            <w:tcW w:type="dxa" w:w="1701"/>
+            <w:tcW w:type="dxa" w:w="1345"/>
             <w:tcBorders>
               <w:top w:val="single" w:color="BFBFBF" w:sz="4"/>
               <w:left w:val="single" w:color="BFBFBF" w:sz="4"/>
@@ -7809,7 +8117,7 @@
         </w:tc>
         <w:tc>
           <w:tcPr>
-            <w:tcW w:type="dxa" w:w="1918"/>
+            <w:tcW w:type="dxa" w:w="1516"/>
             <w:tcBorders>
               <w:top w:val="single" w:color="BFBFBF" w:sz="4"/>
               <w:left w:val="single" w:color="BFBFBF" w:sz="4"/>
@@ -7840,7 +8148,7 @@
         </w:trPr>
         <w:tc>
           <w:tcPr>
-            <w:tcW w:type="dxa" w:w="3403"/>
+            <w:tcW w:type="dxa" w:w="5548"/>
             <w:tcBorders>
               <w:top w:val="single" w:color="BFBFBF" w:sz="4"/>
               <w:left w:val="single" w:color="BFBFBF" w:sz="4"/>
@@ -7866,7 +8174,7 @@
         </w:tc>
         <w:tc>
           <w:tcPr>
-            <w:tcW w:type="dxa" w:w="4041"/>
+            <w:tcW w:type="dxa" w:w="3278"/>
             <w:tcBorders>
               <w:top w:val="single" w:color="BFBFBF" w:sz="4"/>
               <w:left w:val="single" w:color="BFBFBF" w:sz="4"/>
@@ -7892,7 +8200,7 @@
         </w:tc>
         <w:tc>
           <w:tcPr>
-            <w:tcW w:type="dxa" w:w="1914"/>
+            <w:tcW w:type="dxa" w:w="1513"/>
             <w:tcBorders>
               <w:top w:val="single" w:color="BFBFBF" w:sz="4"/>
               <w:left w:val="single" w:color="BFBFBF" w:sz="4"/>
@@ -7918,7 +8226,7 @@
         </w:tc>
         <w:tc>
           <w:tcPr>
-            <w:tcW w:type="dxa" w:w="1063"/>
+            <w:tcW w:type="dxa" w:w="840"/>
             <w:tcBorders>
               <w:top w:val="single" w:color="BFBFBF" w:sz="4"/>
               <w:left w:val="single" w:color="BFBFBF" w:sz="4"/>
@@ -7944,7 +8252,7 @@
         </w:tc>
         <w:tc>
           <w:tcPr>
-            <w:tcW w:type="dxa" w:w="1701"/>
+            <w:tcW w:type="dxa" w:w="1345"/>
             <w:tcBorders>
               <w:top w:val="single" w:color="BFBFBF" w:sz="4"/>
               <w:left w:val="single" w:color="BFBFBF" w:sz="4"/>
@@ -7970,7 +8278,7 @@
         </w:tc>
         <w:tc>
           <w:tcPr>
-            <w:tcW w:type="dxa" w:w="1918"/>
+            <w:tcW w:type="dxa" w:w="1516"/>
             <w:tcBorders>
               <w:top w:val="single" w:color="BFBFBF" w:sz="4"/>
               <w:left w:val="single" w:color="BFBFBF" w:sz="4"/>
@@ -8001,7 +8309,7 @@
         </w:trPr>
         <w:tc>
           <w:tcPr>
-            <w:tcW w:type="dxa" w:w="3403"/>
+            <w:tcW w:type="dxa" w:w="5548"/>
             <w:tcBorders>
               <w:top w:val="single" w:color="BFBFBF" w:sz="4"/>
               <w:left w:val="single" w:color="BFBFBF" w:sz="4"/>
@@ -8027,7 +8335,7 @@
         </w:tc>
         <w:tc>
           <w:tcPr>
-            <w:tcW w:type="dxa" w:w="4041"/>
+            <w:tcW w:type="dxa" w:w="3278"/>
             <w:tcBorders>
               <w:top w:val="single" w:color="BFBFBF" w:sz="4"/>
               <w:left w:val="single" w:color="BFBFBF" w:sz="4"/>
@@ -8053,7 +8361,7 @@
         </w:tc>
         <w:tc>
           <w:tcPr>
-            <w:tcW w:type="dxa" w:w="1914"/>
+            <w:tcW w:type="dxa" w:w="1513"/>
             <w:tcBorders>
               <w:top w:val="single" w:color="BFBFBF" w:sz="4"/>
               <w:left w:val="single" w:color="BFBFBF" w:sz="4"/>
@@ -8079,7 +8387,7 @@
         </w:tc>
         <w:tc>
           <w:tcPr>
-            <w:tcW w:type="dxa" w:w="1063"/>
+            <w:tcW w:type="dxa" w:w="840"/>
             <w:tcBorders>
               <w:top w:val="single" w:color="BFBFBF" w:sz="4"/>
               <w:left w:val="single" w:color="BFBFBF" w:sz="4"/>
@@ -8105,7 +8413,7 @@
         </w:tc>
         <w:tc>
           <w:tcPr>
-            <w:tcW w:type="dxa" w:w="1701"/>
+            <w:tcW w:type="dxa" w:w="1345"/>
             <w:tcBorders>
               <w:top w:val="single" w:color="BFBFBF" w:sz="4"/>
               <w:left w:val="single" w:color="BFBFBF" w:sz="4"/>
@@ -8131,7 +8439,7 @@
         </w:tc>
         <w:tc>
           <w:tcPr>
-            <w:tcW w:type="dxa" w:w="1918"/>
+            <w:tcW w:type="dxa" w:w="1516"/>
             <w:tcBorders>
               <w:top w:val="single" w:color="BFBFBF" w:sz="4"/>
               <w:left w:val="single" w:color="BFBFBF" w:sz="4"/>
@@ -8162,7 +8470,7 @@
         </w:trPr>
         <w:tc>
           <w:tcPr>
-            <w:tcW w:type="dxa" w:w="3403"/>
+            <w:tcW w:type="dxa" w:w="5548"/>
             <w:tcBorders>
               <w:top w:val="single" w:color="BFBFBF" w:sz="4"/>
               <w:left w:val="single" w:color="BFBFBF" w:sz="4"/>
@@ -8188,7 +8496,7 @@
         </w:tc>
         <w:tc>
           <w:tcPr>
-            <w:tcW w:type="dxa" w:w="4041"/>
+            <w:tcW w:type="dxa" w:w="3278"/>
             <w:tcBorders>
               <w:top w:val="single" w:color="BFBFBF" w:sz="4"/>
               <w:left w:val="single" w:color="BFBFBF" w:sz="4"/>
@@ -8214,7 +8522,7 @@
         </w:tc>
         <w:tc>
           <w:tcPr>
-            <w:tcW w:type="dxa" w:w="1914"/>
+            <w:tcW w:type="dxa" w:w="1513"/>
             <w:tcBorders>
               <w:top w:val="single" w:color="BFBFBF" w:sz="4"/>
               <w:left w:val="single" w:color="BFBFBF" w:sz="4"/>
@@ -8240,7 +8548,7 @@
         </w:tc>
         <w:tc>
           <w:tcPr>
-            <w:tcW w:type="dxa" w:w="1063"/>
+            <w:tcW w:type="dxa" w:w="840"/>
             <w:tcBorders>
               <w:top w:val="single" w:color="BFBFBF" w:sz="4"/>
               <w:left w:val="single" w:color="BFBFBF" w:sz="4"/>
@@ -8266,7 +8574,7 @@
         </w:tc>
         <w:tc>
           <w:tcPr>
-            <w:tcW w:type="dxa" w:w="1701"/>
+            <w:tcW w:type="dxa" w:w="1345"/>
             <w:tcBorders>
               <w:top w:val="single" w:color="BFBFBF" w:sz="4"/>
               <w:left w:val="single" w:color="BFBFBF" w:sz="4"/>
@@ -8292,7 +8600,7 @@
         </w:tc>
         <w:tc>
           <w:tcPr>
-            <w:tcW w:type="dxa" w:w="1918"/>
+            <w:tcW w:type="dxa" w:w="1516"/>
             <w:tcBorders>
               <w:top w:val="single" w:color="BFBFBF" w:sz="4"/>
               <w:left w:val="single" w:color="BFBFBF" w:sz="4"/>
@@ -8323,7 +8631,7 @@
         </w:trPr>
         <w:tc>
           <w:tcPr>
-            <w:tcW w:type="dxa" w:w="3403"/>
+            <w:tcW w:type="dxa" w:w="5548"/>
             <w:tcBorders>
               <w:top w:val="single" w:color="BFBFBF" w:sz="4"/>
               <w:left w:val="single" w:color="BFBFBF" w:sz="4"/>
@@ -8349,7 +8657,7 @@
         </w:tc>
         <w:tc>
           <w:tcPr>
-            <w:tcW w:type="dxa" w:w="4041"/>
+            <w:tcW w:type="dxa" w:w="3278"/>
             <w:tcBorders>
               <w:top w:val="single" w:color="BFBFBF" w:sz="4"/>
               <w:left w:val="single" w:color="BFBFBF" w:sz="4"/>
@@ -8375,7 +8683,7 @@
         </w:tc>
         <w:tc>
           <w:tcPr>
-            <w:tcW w:type="dxa" w:w="1914"/>
+            <w:tcW w:type="dxa" w:w="1513"/>
             <w:tcBorders>
               <w:top w:val="single" w:color="BFBFBF" w:sz="4"/>
               <w:left w:val="single" w:color="BFBFBF" w:sz="4"/>
@@ -8401,7 +8709,7 @@
         </w:tc>
         <w:tc>
           <w:tcPr>
-            <w:tcW w:type="dxa" w:w="1063"/>
+            <w:tcW w:type="dxa" w:w="840"/>
             <w:tcBorders>
               <w:top w:val="single" w:color="BFBFBF" w:sz="4"/>
               <w:left w:val="single" w:color="BFBFBF" w:sz="4"/>
@@ -8427,7 +8735,7 @@
         </w:tc>
         <w:tc>
           <w:tcPr>
-            <w:tcW w:type="dxa" w:w="1701"/>
+            <w:tcW w:type="dxa" w:w="1345"/>
             <w:tcBorders>
               <w:top w:val="single" w:color="BFBFBF" w:sz="4"/>
               <w:left w:val="single" w:color="BFBFBF" w:sz="4"/>
@@ -8453,7 +8761,7 @@
         </w:tc>
         <w:tc>
           <w:tcPr>
-            <w:tcW w:type="dxa" w:w="1918"/>
+            <w:tcW w:type="dxa" w:w="1516"/>
             <w:tcBorders>
               <w:top w:val="single" w:color="BFBFBF" w:sz="4"/>
               <w:left w:val="single" w:color="BFBFBF" w:sz="4"/>
@@ -8484,59 +8792,59 @@
         </w:trPr>
         <w:tc>
           <w:tcPr>
-            <w:tcW w:type="dxa" w:w="3403"/>
-            <w:tcBorders>
-              <w:top w:val="single" w:color="BFBFBF" w:sz="4"/>
-              <w:left w:val="single" w:color="BFBFBF" w:sz="4"/>
-              <w:bottom w:val="single" w:color="BFBFBF" w:sz="4"/>
-              <w:right w:val="single" w:color="BFBFBF" w:sz="4"/>
-            </w:tcBorders>
-            <w:tcMar>
-              <w:top w:type="dxa" w:w="60"/>
-              <w:left w:type="dxa" w:w="90"/>
-              <w:bottom w:type="dxa" w:w="60"/>
-              <w:right w:type="dxa" w:w="90"/>
-            </w:tcMar>
-          </w:tcPr>
-          <w:p>
-            <w:r>
-              <w:rPr>
-                <w:sz w:val="17"/>
-                <w:szCs w:val="17"/>
-              </w:rPr>
-              <w:t xml:space="preserve">king silk sheets</w:t>
-            </w:r>
-          </w:p>
-        </w:tc>
-        <w:tc>
-          <w:tcPr>
-            <w:tcW w:type="dxa" w:w="4041"/>
-            <w:tcBorders>
-              <w:top w:val="single" w:color="BFBFBF" w:sz="4"/>
-              <w:left w:val="single" w:color="BFBFBF" w:sz="4"/>
-              <w:bottom w:val="single" w:color="BFBFBF" w:sz="4"/>
-              <w:right w:val="single" w:color="BFBFBF" w:sz="4"/>
-            </w:tcBorders>
-            <w:tcMar>
-              <w:top w:type="dxa" w:w="60"/>
-              <w:left w:type="dxa" w:w="90"/>
-              <w:bottom w:type="dxa" w:w="60"/>
-              <w:right w:type="dxa" w:w="90"/>
-            </w:tcMar>
-          </w:tcPr>
-          <w:p>
-            <w:r>
-              <w:rPr>
-                <w:sz w:val="17"/>
-                <w:szCs w:val="17"/>
-              </w:rPr>
-              <w:t xml:space="preserve">$2.50</w:t>
-            </w:r>
-          </w:p>
-        </w:tc>
-        <w:tc>
-          <w:tcPr>
-            <w:tcW w:type="dxa" w:w="1914"/>
+            <w:tcW w:type="dxa" w:w="5548"/>
+            <w:tcBorders>
+              <w:top w:val="single" w:color="BFBFBF" w:sz="4"/>
+              <w:left w:val="single" w:color="BFBFBF" w:sz="4"/>
+              <w:bottom w:val="single" w:color="BFBFBF" w:sz="4"/>
+              <w:right w:val="single" w:color="BFBFBF" w:sz="4"/>
+            </w:tcBorders>
+            <w:tcMar>
+              <w:top w:type="dxa" w:w="60"/>
+              <w:left w:type="dxa" w:w="90"/>
+              <w:bottom w:type="dxa" w:w="60"/>
+              <w:right w:type="dxa" w:w="90"/>
+            </w:tcMar>
+          </w:tcPr>
+          <w:p>
+            <w:r>
+              <w:rPr>
+                <w:sz w:val="17"/>
+                <w:szCs w:val="17"/>
+              </w:rPr>
+              <w:t xml:space="preserve">king silk sheets (in 104969852664268, the owner on King Black)</w:t>
+            </w:r>
+          </w:p>
+        </w:tc>
+        <w:tc>
+          <w:tcPr>
+            <w:tcW w:type="dxa" w:w="3278"/>
+            <w:tcBorders>
+              <w:top w:val="single" w:color="BFBFBF" w:sz="4"/>
+              <w:left w:val="single" w:color="BFBFBF" w:sz="4"/>
+              <w:bottom w:val="single" w:color="BFBFBF" w:sz="4"/>
+              <w:right w:val="single" w:color="BFBFBF" w:sz="4"/>
+            </w:tcBorders>
+            <w:tcMar>
+              <w:top w:type="dxa" w:w="60"/>
+              <w:left w:type="dxa" w:w="90"/>
+              <w:bottom w:type="dxa" w:w="60"/>
+              <w:right w:type="dxa" w:w="90"/>
+            </w:tcMar>
+          </w:tcPr>
+          <w:p>
+            <w:r>
+              <w:rPr>
+                <w:sz w:val="17"/>
+                <w:szCs w:val="17"/>
+              </w:rPr>
+              <w:t xml:space="preserve">$2.74 (B's bulk row, 100% → 151%)</w:t>
+            </w:r>
+          </w:p>
+        </w:tc>
+        <w:tc>
+          <w:tcPr>
+            <w:tcW w:type="dxa" w:w="1513"/>
             <w:tcBorders>
               <w:top w:val="single" w:color="BFBFBF" w:sz="4"/>
               <w:left w:val="single" w:color="BFBFBF" w:sz="4"/>
@@ -8562,7 +8870,7 @@
         </w:tc>
         <w:tc>
           <w:tcPr>
-            <w:tcW w:type="dxa" w:w="1063"/>
+            <w:tcW w:type="dxa" w:w="840"/>
             <w:tcBorders>
               <w:top w:val="single" w:color="BFBFBF" w:sz="4"/>
               <w:left w:val="single" w:color="BFBFBF" w:sz="4"/>
@@ -8588,33 +8896,33 @@
         </w:tc>
         <w:tc>
           <w:tcPr>
-            <w:tcW w:type="dxa" w:w="1701"/>
-            <w:tcBorders>
-              <w:top w:val="single" w:color="BFBFBF" w:sz="4"/>
-              <w:left w:val="single" w:color="BFBFBF" w:sz="4"/>
-              <w:bottom w:val="single" w:color="BFBFBF" w:sz="4"/>
-              <w:right w:val="single" w:color="BFBFBF" w:sz="4"/>
-            </w:tcBorders>
-            <w:tcMar>
-              <w:top w:type="dxa" w:w="60"/>
-              <w:left w:type="dxa" w:w="90"/>
-              <w:bottom w:type="dxa" w:w="60"/>
-              <w:right w:type="dxa" w:w="90"/>
-            </w:tcMar>
-          </w:tcPr>
-          <w:p>
-            <w:r>
-              <w:rPr>
-                <w:sz w:val="17"/>
-                <w:szCs w:val="17"/>
-              </w:rPr>
-              <w:t xml:space="preserve">about $55</w:t>
-            </w:r>
-          </w:p>
-        </w:tc>
-        <w:tc>
-          <w:tcPr>
-            <w:tcW w:type="dxa" w:w="1918"/>
+            <w:tcW w:type="dxa" w:w="1345"/>
+            <w:tcBorders>
+              <w:top w:val="single" w:color="BFBFBF" w:sz="4"/>
+              <w:left w:val="single" w:color="BFBFBF" w:sz="4"/>
+              <w:bottom w:val="single" w:color="BFBFBF" w:sz="4"/>
+              <w:right w:val="single" w:color="BFBFBF" w:sz="4"/>
+            </w:tcBorders>
+            <w:tcMar>
+              <w:top w:type="dxa" w:w="60"/>
+              <w:left w:type="dxa" w:w="90"/>
+              <w:bottom w:type="dxa" w:w="60"/>
+              <w:right w:type="dxa" w:w="90"/>
+            </w:tcMar>
+          </w:tcPr>
+          <w:p>
+            <w:r>
+              <w:rPr>
+                <w:sz w:val="17"/>
+                <w:szCs w:val="17"/>
+              </w:rPr>
+              <w:t xml:space="preserve">about $58</w:t>
+            </w:r>
+          </w:p>
+        </w:tc>
+        <w:tc>
+          <w:tcPr>
+            <w:tcW w:type="dxa" w:w="1516"/>
             <w:tcBorders>
               <w:top w:val="single" w:color="BFBFBF" w:sz="4"/>
               <w:left w:val="single" w:color="BFBFBF" w:sz="4"/>
@@ -8646,7 +8954,7 @@
         <w:spacing w:after="120"/>
       </w:pPr>
       <w:r>
-        <w:t xml:space="preserve">Total: about $695.</w:t>
+        <w:t xml:space="preserve">Total: about $700.</w:t>
       </w:r>
     </w:p>
     <w:p>
@@ -8691,6 +8999,21 @@
       </w:pPr>
       <w:r>
         <w:t xml:space="preserve">4.4 Bids and placements on ranking campaigns</w:t>
+      </w:r>
+    </w:p>
+    <w:p>
+      <w:pPr>
+        <w:spacing w:after="120"/>
+      </w:pPr>
+      <w:r>
+        <w:rPr>
+          <w:b/>
+          <w:bCs/>
+        </w:rPr>
+        <w:t xml:space="preserve">Where the rejected cuts come from.</w:t>
+      </w:r>
+      <w:r>
+        <w:t xml:space="preserve"> Every ranking-term cut both reviews reject cites the "Maintenance Profit Control" canvas, class HARD (operator 2026-09-24/25), "−25% off the top-of-search price". So does the $20 → $10 budget cut on "king size silk sheet set". They aren't the engine's pricing logic; they are a class setting someone chose. Fix the class (Appendix A), or the next run makes the same cuts.</w:t>
       </w:r>
     </w:p>
     <w:p>
@@ -10177,9 +10500,9 @@
         </w:tblBorders>
       </w:tblPr>
       <w:tblGrid>
-        <w:gridCol w:w="9266"/>
-        <w:gridCol w:w="2106"/>
-        <w:gridCol w:w="2668"/>
+        <w:gridCol w:w="8741"/>
+        <w:gridCol w:w="1986"/>
+        <w:gridCol w:w="3313"/>
       </w:tblGrid>
       <w:tr>
         <w:trPr>
@@ -10187,7 +10510,7 @@
         </w:trPr>
         <w:tc>
           <w:tcPr>
-            <w:tcW w:type="dxa" w:w="9266"/>
+            <w:tcW w:type="dxa" w:w="8741"/>
             <w:tcBorders>
               <w:top w:val="single" w:color="BFBFBF" w:sz="4"/>
               <w:left w:val="single" w:color="BFBFBF" w:sz="4"/>
@@ -10217,7 +10540,7 @@
         </w:tc>
         <w:tc>
           <w:tcPr>
-            <w:tcW w:type="dxa" w:w="2106"/>
+            <w:tcW w:type="dxa" w:w="1986"/>
             <w:tcBorders>
               <w:top w:val="single" w:color="BFBFBF" w:sz="4"/>
               <w:left w:val="single" w:color="BFBFBF" w:sz="4"/>
@@ -10247,7 +10570,7 @@
         </w:tc>
         <w:tc>
           <w:tcPr>
-            <w:tcW w:type="dxa" w:w="2668"/>
+            <w:tcW w:type="dxa" w:w="3313"/>
             <w:tcBorders>
               <w:top w:val="single" w:color="BFBFBF" w:sz="4"/>
               <w:left w:val="single" w:color="BFBFBF" w:sz="4"/>
@@ -10282,7 +10605,7 @@
         </w:trPr>
         <w:tc>
           <w:tcPr>
-            <w:tcW w:type="dxa" w:w="9266"/>
+            <w:tcW w:type="dxa" w:w="8741"/>
             <w:tcBorders>
               <w:top w:val="single" w:color="BFBFBF" w:sz="4"/>
               <w:left w:val="single" w:color="BFBFBF" w:sz="4"/>
@@ -10308,7 +10631,7 @@
         </w:tc>
         <w:tc>
           <w:tcPr>
-            <w:tcW w:type="dxa" w:w="2106"/>
+            <w:tcW w:type="dxa" w:w="1986"/>
             <w:tcBorders>
               <w:top w:val="single" w:color="BFBFBF" w:sz="4"/>
               <w:left w:val="single" w:color="BFBFBF" w:sz="4"/>
@@ -10334,7 +10657,7 @@
         </w:tc>
         <w:tc>
           <w:tcPr>
-            <w:tcW w:type="dxa" w:w="2668"/>
+            <w:tcW w:type="dxa" w:w="3313"/>
             <w:tcBorders>
               <w:top w:val="single" w:color="BFBFBF" w:sz="4"/>
               <w:left w:val="single" w:color="BFBFBF" w:sz="4"/>
@@ -10365,7 +10688,7 @@
         </w:trPr>
         <w:tc>
           <w:tcPr>
-            <w:tcW w:type="dxa" w:w="9266"/>
+            <w:tcW w:type="dxa" w:w="8741"/>
             <w:tcBorders>
               <w:top w:val="single" w:color="BFBFBF" w:sz="4"/>
               <w:left w:val="single" w:color="BFBFBF" w:sz="4"/>
@@ -10391,7 +10714,7 @@
         </w:tc>
         <w:tc>
           <w:tcPr>
-            <w:tcW w:type="dxa" w:w="2106"/>
+            <w:tcW w:type="dxa" w:w="1986"/>
             <w:tcBorders>
               <w:top w:val="single" w:color="BFBFBF" w:sz="4"/>
               <w:left w:val="single" w:color="BFBFBF" w:sz="4"/>
@@ -10417,7 +10740,7 @@
         </w:tc>
         <w:tc>
           <w:tcPr>
-            <w:tcW w:type="dxa" w:w="2668"/>
+            <w:tcW w:type="dxa" w:w="3313"/>
             <w:tcBorders>
               <w:top w:val="single" w:color="BFBFBF" w:sz="4"/>
               <w:left w:val="single" w:color="BFBFBF" w:sz="4"/>
@@ -10448,7 +10771,7 @@
         </w:trPr>
         <w:tc>
           <w:tcPr>
-            <w:tcW w:type="dxa" w:w="9266"/>
+            <w:tcW w:type="dxa" w:w="8741"/>
             <w:tcBorders>
               <w:top w:val="single" w:color="BFBFBF" w:sz="4"/>
               <w:left w:val="single" w:color="BFBFBF" w:sz="4"/>
@@ -10474,7 +10797,7 @@
         </w:tc>
         <w:tc>
           <w:tcPr>
-            <w:tcW w:type="dxa" w:w="2106"/>
+            <w:tcW w:type="dxa" w:w="1986"/>
             <w:tcBorders>
               <w:top w:val="single" w:color="BFBFBF" w:sz="4"/>
               <w:left w:val="single" w:color="BFBFBF" w:sz="4"/>
@@ -10500,7 +10823,7 @@
         </w:tc>
         <w:tc>
           <w:tcPr>
-            <w:tcW w:type="dxa" w:w="2668"/>
+            <w:tcW w:type="dxa" w:w="3313"/>
             <w:tcBorders>
               <w:top w:val="single" w:color="BFBFBF" w:sz="4"/>
               <w:left w:val="single" w:color="BFBFBF" w:sz="4"/>
@@ -10531,7 +10854,7 @@
         </w:trPr>
         <w:tc>
           <w:tcPr>
-            <w:tcW w:type="dxa" w:w="9266"/>
+            <w:tcW w:type="dxa" w:w="8741"/>
             <w:tcBorders>
               <w:top w:val="single" w:color="BFBFBF" w:sz="4"/>
               <w:left w:val="single" w:color="BFBFBF" w:sz="4"/>
@@ -10557,7 +10880,7 @@
         </w:tc>
         <w:tc>
           <w:tcPr>
-            <w:tcW w:type="dxa" w:w="2106"/>
+            <w:tcW w:type="dxa" w:w="1986"/>
             <w:tcBorders>
               <w:top w:val="single" w:color="BFBFBF" w:sz="4"/>
               <w:left w:val="single" w:color="BFBFBF" w:sz="4"/>
@@ -10583,7 +10906,7 @@
         </w:tc>
         <w:tc>
           <w:tcPr>
-            <w:tcW w:type="dxa" w:w="2668"/>
+            <w:tcW w:type="dxa" w:w="3313"/>
             <w:tcBorders>
               <w:top w:val="single" w:color="BFBFBF" w:sz="4"/>
               <w:left w:val="single" w:color="BFBFBF" w:sz="4"/>
@@ -10614,7 +10937,7 @@
         </w:trPr>
         <w:tc>
           <w:tcPr>
-            <w:tcW w:type="dxa" w:w="9266"/>
+            <w:tcW w:type="dxa" w:w="8741"/>
             <w:tcBorders>
               <w:top w:val="single" w:color="BFBFBF" w:sz="4"/>
               <w:left w:val="single" w:color="BFBFBF" w:sz="4"/>
@@ -10640,7 +10963,7 @@
         </w:tc>
         <w:tc>
           <w:tcPr>
-            <w:tcW w:type="dxa" w:w="2106"/>
+            <w:tcW w:type="dxa" w:w="1986"/>
             <w:tcBorders>
               <w:top w:val="single" w:color="BFBFBF" w:sz="4"/>
               <w:left w:val="single" w:color="BFBFBF" w:sz="4"/>
@@ -10666,7 +10989,7 @@
         </w:tc>
         <w:tc>
           <w:tcPr>
-            <w:tcW w:type="dxa" w:w="2668"/>
+            <w:tcW w:type="dxa" w:w="3313"/>
             <w:tcBorders>
               <w:top w:val="single" w:color="BFBFBF" w:sz="4"/>
               <w:left w:val="single" w:color="BFBFBF" w:sz="4"/>
@@ -10697,79 +11020,79 @@
         </w:trPr>
         <w:tc>
           <w:tcPr>
-            <w:tcW w:type="dxa" w:w="9266"/>
-            <w:tcBorders>
-              <w:top w:val="single" w:color="BFBFBF" w:sz="4"/>
-              <w:left w:val="single" w:color="BFBFBF" w:sz="4"/>
-              <w:bottom w:val="single" w:color="BFBFBF" w:sz="4"/>
-              <w:right w:val="single" w:color="BFBFBF" w:sz="4"/>
-            </w:tcBorders>
-            <w:tcMar>
-              <w:top w:type="dxa" w:w="60"/>
-              <w:left w:type="dxa" w:w="90"/>
-              <w:bottom w:type="dxa" w:w="60"/>
-              <w:right w:type="dxa" w:w="90"/>
-            </w:tcMar>
-          </w:tcPr>
-          <w:p>
-            <w:r>
-              <w:rPr>
-                <w:sz w:val="17"/>
-                <w:szCs w:val="17"/>
-              </w:rPr>
-              <w:t xml:space="preserve">Remaining King Red campaigns (non-ranking exacts) → King Black</w:t>
-            </w:r>
-          </w:p>
-        </w:tc>
-        <w:tc>
-          <w:tcPr>
-            <w:tcW w:type="dxa" w:w="2106"/>
-            <w:tcBorders>
-              <w:top w:val="single" w:color="BFBFBF" w:sz="4"/>
-              <w:left w:val="single" w:color="BFBFBF" w:sz="4"/>
-              <w:bottom w:val="single" w:color="BFBFBF" w:sz="4"/>
-              <w:right w:val="single" w:color="BFBFBF" w:sz="4"/>
-            </w:tcBorders>
-            <w:tcMar>
-              <w:top w:type="dxa" w:w="60"/>
-              <w:left w:type="dxa" w:w="90"/>
-              <w:bottom w:type="dxa" w:w="60"/>
-              <w:right w:type="dxa" w:w="90"/>
-            </w:tcMar>
-          </w:tcPr>
-          <w:p>
-            <w:r>
-              <w:rPr>
-                <w:sz w:val="17"/>
-                <w:szCs w:val="17"/>
-              </w:rPr>
-              <w:t xml:space="preserve">about 19</w:t>
-            </w:r>
-          </w:p>
-        </w:tc>
-        <w:tc>
-          <w:tcPr>
-            <w:tcW w:type="dxa" w:w="2668"/>
-            <w:tcBorders>
-              <w:top w:val="single" w:color="BFBFBF" w:sz="4"/>
-              <w:left w:val="single" w:color="BFBFBF" w:sz="4"/>
-              <w:bottom w:val="single" w:color="BFBFBF" w:sz="4"/>
-              <w:right w:val="single" w:color="BFBFBF" w:sz="4"/>
-            </w:tcBorders>
-            <w:tcMar>
-              <w:top w:type="dxa" w:w="60"/>
-              <w:left w:type="dxa" w:w="90"/>
-              <w:bottom w:type="dxa" w:w="60"/>
-              <w:right w:type="dxa" w:w="90"/>
-            </w:tcMar>
-          </w:tcPr>
-          <w:p>
-            <w:r>
-              <w:rPr>
-                <w:sz w:val="17"/>
-                <w:szCs w:val="17"/>
-              </w:rPr>
-              <w:t xml:space="preserve">A, needs IDs</w:t>
+            <w:tcW w:type="dxa" w:w="8741"/>
+            <w:tcBorders>
+              <w:top w:val="single" w:color="BFBFBF" w:sz="4"/>
+              <w:left w:val="single" w:color="BFBFBF" w:sz="4"/>
+              <w:bottom w:val="single" w:color="BFBFBF" w:sz="4"/>
+              <w:right w:val="single" w:color="BFBFBF" w:sz="4"/>
+            </w:tcBorders>
+            <w:tcMar>
+              <w:top w:type="dxa" w:w="60"/>
+              <w:left w:type="dxa" w:w="90"/>
+              <w:bottom w:type="dxa" w:w="60"/>
+              <w:right w:type="dxa" w:w="90"/>
+            </w:tcMar>
+          </w:tcPr>
+          <w:p>
+            <w:r>
+              <w:rPr>
+                <w:sz w:val="17"/>
+                <w:szCs w:val="17"/>
+              </w:rPr>
+              <w:t xml:space="preserve">The engine's own 4 remaining King Red → King Black swaps (115945491796009, 366512299532067, 418544331879936, 453136081616064): correct, credited to the engine, loaded by console</w:t>
+            </w:r>
+          </w:p>
+        </w:tc>
+        <w:tc>
+          <w:tcPr>
+            <w:tcW w:type="dxa" w:w="1986"/>
+            <w:tcBorders>
+              <w:top w:val="single" w:color="BFBFBF" w:sz="4"/>
+              <w:left w:val="single" w:color="BFBFBF" w:sz="4"/>
+              <w:bottom w:val="single" w:color="BFBFBF" w:sz="4"/>
+              <w:right w:val="single" w:color="BFBFBF" w:sz="4"/>
+            </w:tcBorders>
+            <w:tcMar>
+              <w:top w:type="dxa" w:w="60"/>
+              <w:left w:type="dxa" w:w="90"/>
+              <w:bottom w:type="dxa" w:w="60"/>
+              <w:right w:type="dxa" w:w="90"/>
+            </w:tcMar>
+          </w:tcPr>
+          <w:p>
+            <w:r>
+              <w:rPr>
+                <w:sz w:val="17"/>
+                <w:szCs w:val="17"/>
+              </w:rPr>
+              <w:t xml:space="preserve">4</w:t>
+            </w:r>
+          </w:p>
+        </w:tc>
+        <w:tc>
+          <w:tcPr>
+            <w:tcW w:type="dxa" w:w="3313"/>
+            <w:tcBorders>
+              <w:top w:val="single" w:color="BFBFBF" w:sz="4"/>
+              <w:left w:val="single" w:color="BFBFBF" w:sz="4"/>
+              <w:bottom w:val="single" w:color="BFBFBF" w:sz="4"/>
+              <w:right w:val="single" w:color="BFBFBF" w:sz="4"/>
+            </w:tcBorders>
+            <w:tcMar>
+              <w:top w:type="dxa" w:w="60"/>
+              <w:left w:type="dxa" w:w="90"/>
+              <w:bottom w:type="dxa" w:w="60"/>
+              <w:right w:type="dxa" w:w="90"/>
+            </w:tcMar>
+          </w:tcPr>
+          <w:p>
+            <w:r>
+              <w:rPr>
+                <w:sz w:val="17"/>
+                <w:szCs w:val="17"/>
+              </w:rPr>
+              <w:t xml:space="preserve">Engine (A, B agree)</w:t>
             </w:r>
           </w:p>
         </w:tc>
@@ -10780,79 +11103,79 @@
         </w:trPr>
         <w:tc>
           <w:tcPr>
-            <w:tcW w:type="dxa" w:w="9266"/>
-            <w:tcBorders>
-              <w:top w:val="single" w:color="BFBFBF" w:sz="4"/>
-              <w:left w:val="single" w:color="BFBFBF" w:sz="4"/>
-              <w:bottom w:val="single" w:color="BFBFBF" w:sz="4"/>
-              <w:right w:val="single" w:color="BFBFBF" w:sz="4"/>
-            </w:tcBorders>
-            <w:tcMar>
-              <w:top w:type="dxa" w:w="60"/>
-              <w:left w:type="dxa" w:w="90"/>
-              <w:bottom w:type="dxa" w:w="60"/>
-              <w:right w:type="dxa" w:w="90"/>
-            </w:tcMar>
-          </w:tcPr>
-          <w:p>
-            <w:r>
-              <w:rPr>
-                <w:sz w:val="17"/>
-                <w:szCs w:val="17"/>
-              </w:rPr>
-              <w:t xml:space="preserve">"decolure" brand exact (Champagne Queen, 0 stock) → Queen Black; "pink satin sheets queen" → Queen Pink</w:t>
-            </w:r>
-          </w:p>
-        </w:tc>
-        <w:tc>
-          <w:tcPr>
-            <w:tcW w:type="dxa" w:w="2106"/>
-            <w:tcBorders>
-              <w:top w:val="single" w:color="BFBFBF" w:sz="4"/>
-              <w:left w:val="single" w:color="BFBFBF" w:sz="4"/>
-              <w:bottom w:val="single" w:color="BFBFBF" w:sz="4"/>
-              <w:right w:val="single" w:color="BFBFBF" w:sz="4"/>
-            </w:tcBorders>
-            <w:tcMar>
-              <w:top w:type="dxa" w:w="60"/>
-              <w:left w:type="dxa" w:w="90"/>
-              <w:bottom w:type="dxa" w:w="60"/>
-              <w:right w:type="dxa" w:w="90"/>
-            </w:tcMar>
-          </w:tcPr>
-          <w:p>
-            <w:r>
-              <w:rPr>
-                <w:sz w:val="17"/>
-                <w:szCs w:val="17"/>
-              </w:rPr>
-              <w:t xml:space="preserve">2</w:t>
-            </w:r>
-          </w:p>
-        </w:tc>
-        <w:tc>
-          <w:tcPr>
-            <w:tcW w:type="dxa" w:w="2668"/>
-            <w:tcBorders>
-              <w:top w:val="single" w:color="BFBFBF" w:sz="4"/>
-              <w:left w:val="single" w:color="BFBFBF" w:sz="4"/>
-              <w:bottom w:val="single" w:color="BFBFBF" w:sz="4"/>
-              <w:right w:val="single" w:color="BFBFBF" w:sz="4"/>
-            </w:tcBorders>
-            <w:tcMar>
-              <w:top w:type="dxa" w:w="60"/>
-              <w:left w:type="dxa" w:w="90"/>
-              <w:bottom w:type="dxa" w:w="60"/>
-              <w:right w:type="dxa" w:w="90"/>
-            </w:tcMar>
-          </w:tcPr>
-          <w:p>
-            <w:r>
-              <w:rPr>
-                <w:sz w:val="17"/>
-                <w:szCs w:val="17"/>
-              </w:rPr>
-              <w:t xml:space="preserve">A</w:t>
+            <w:tcW w:type="dxa" w:w="8741"/>
+            <w:tcBorders>
+              <w:top w:val="single" w:color="BFBFBF" w:sz="4"/>
+              <w:left w:val="single" w:color="BFBFBF" w:sz="4"/>
+              <w:bottom w:val="single" w:color="BFBFBF" w:sz="4"/>
+              <w:right w:val="single" w:color="BFBFBF" w:sz="4"/>
+            </w:tcBorders>
+            <w:tcMar>
+              <w:top w:type="dxa" w:w="60"/>
+              <w:left w:type="dxa" w:w="90"/>
+              <w:bottom w:type="dxa" w:w="60"/>
+              <w:right w:type="dxa" w:w="90"/>
+            </w:tcMar>
+          </w:tcPr>
+          <w:p>
+            <w:r>
+              <w:rPr>
+                <w:sz w:val="17"/>
+                <w:szCs w:val="17"/>
+              </w:rPr>
+              <w:t xml:space="preserve">Other King Red campaigns (non-ranking exacts) → King Black</w:t>
+            </w:r>
+          </w:p>
+        </w:tc>
+        <w:tc>
+          <w:tcPr>
+            <w:tcW w:type="dxa" w:w="1986"/>
+            <w:tcBorders>
+              <w:top w:val="single" w:color="BFBFBF" w:sz="4"/>
+              <w:left w:val="single" w:color="BFBFBF" w:sz="4"/>
+              <w:bottom w:val="single" w:color="BFBFBF" w:sz="4"/>
+              <w:right w:val="single" w:color="BFBFBF" w:sz="4"/>
+            </w:tcBorders>
+            <w:tcMar>
+              <w:top w:type="dxa" w:w="60"/>
+              <w:left w:type="dxa" w:w="90"/>
+              <w:bottom w:type="dxa" w:w="60"/>
+              <w:right w:type="dxa" w:w="90"/>
+            </w:tcMar>
+          </w:tcPr>
+          <w:p>
+            <w:r>
+              <w:rPr>
+                <w:sz w:val="17"/>
+                <w:szCs w:val="17"/>
+              </w:rPr>
+              <w:t xml:space="preserve">about 15</w:t>
+            </w:r>
+          </w:p>
+        </w:tc>
+        <w:tc>
+          <w:tcPr>
+            <w:tcW w:type="dxa" w:w="3313"/>
+            <w:tcBorders>
+              <w:top w:val="single" w:color="BFBFBF" w:sz="4"/>
+              <w:left w:val="single" w:color="BFBFBF" w:sz="4"/>
+              <w:bottom w:val="single" w:color="BFBFBF" w:sz="4"/>
+              <w:right w:val="single" w:color="BFBFBF" w:sz="4"/>
+            </w:tcBorders>
+            <w:tcMar>
+              <w:top w:type="dxa" w:w="60"/>
+              <w:left w:type="dxa" w:w="90"/>
+              <w:bottom w:type="dxa" w:w="60"/>
+              <w:right w:type="dxa" w:w="90"/>
+            </w:tcMar>
+          </w:tcPr>
+          <w:p>
+            <w:r>
+              <w:rPr>
+                <w:sz w:val="17"/>
+                <w:szCs w:val="17"/>
+              </w:rPr>
+              <w:t xml:space="preserve">A, needs IDs</w:t>
             </w:r>
           </w:p>
         </w:tc>
@@ -10863,7 +11186,90 @@
         </w:trPr>
         <w:tc>
           <w:tcPr>
-            <w:tcW w:type="dxa" w:w="9266"/>
+            <w:tcW w:type="dxa" w:w="8741"/>
+            <w:tcBorders>
+              <w:top w:val="single" w:color="BFBFBF" w:sz="4"/>
+              <w:left w:val="single" w:color="BFBFBF" w:sz="4"/>
+              <w:bottom w:val="single" w:color="BFBFBF" w:sz="4"/>
+              <w:right w:val="single" w:color="BFBFBF" w:sz="4"/>
+            </w:tcBorders>
+            <w:tcMar>
+              <w:top w:type="dxa" w:w="60"/>
+              <w:left w:type="dxa" w:w="90"/>
+              <w:bottom w:type="dxa" w:w="60"/>
+              <w:right w:type="dxa" w:w="90"/>
+            </w:tcMar>
+          </w:tcPr>
+          <w:p>
+            <w:r>
+              <w:rPr>
+                <w:sz w:val="17"/>
+                <w:szCs w:val="17"/>
+              </w:rPr>
+              <w:t xml:space="preserve">"decolure" brand exact (Champagne Queen, 0 stock) → Queen Black; "pink satin sheets queen" → Queen Pink</w:t>
+            </w:r>
+          </w:p>
+        </w:tc>
+        <w:tc>
+          <w:tcPr>
+            <w:tcW w:type="dxa" w:w="1986"/>
+            <w:tcBorders>
+              <w:top w:val="single" w:color="BFBFBF" w:sz="4"/>
+              <w:left w:val="single" w:color="BFBFBF" w:sz="4"/>
+              <w:bottom w:val="single" w:color="BFBFBF" w:sz="4"/>
+              <w:right w:val="single" w:color="BFBFBF" w:sz="4"/>
+            </w:tcBorders>
+            <w:tcMar>
+              <w:top w:type="dxa" w:w="60"/>
+              <w:left w:type="dxa" w:w="90"/>
+              <w:bottom w:type="dxa" w:w="60"/>
+              <w:right w:type="dxa" w:w="90"/>
+            </w:tcMar>
+          </w:tcPr>
+          <w:p>
+            <w:r>
+              <w:rPr>
+                <w:sz w:val="17"/>
+                <w:szCs w:val="17"/>
+              </w:rPr>
+              <w:t xml:space="preserve">2</w:t>
+            </w:r>
+          </w:p>
+        </w:tc>
+        <w:tc>
+          <w:tcPr>
+            <w:tcW w:type="dxa" w:w="3313"/>
+            <w:tcBorders>
+              <w:top w:val="single" w:color="BFBFBF" w:sz="4"/>
+              <w:left w:val="single" w:color="BFBFBF" w:sz="4"/>
+              <w:bottom w:val="single" w:color="BFBFBF" w:sz="4"/>
+              <w:right w:val="single" w:color="BFBFBF" w:sz="4"/>
+            </w:tcBorders>
+            <w:tcMar>
+              <w:top w:type="dxa" w:w="60"/>
+              <w:left w:type="dxa" w:w="90"/>
+              <w:bottom w:type="dxa" w:w="60"/>
+              <w:right w:type="dxa" w:w="90"/>
+            </w:tcMar>
+          </w:tcPr>
+          <w:p>
+            <w:r>
+              <w:rPr>
+                <w:sz w:val="17"/>
+                <w:szCs w:val="17"/>
+              </w:rPr>
+              <w:t xml:space="preserve">A</w:t>
+            </w:r>
+          </w:p>
+        </w:tc>
+      </w:tr>
+      <w:tr>
+        <w:trPr>
+          <w:tblHeader w:val="off"/>
+        </w:trPr>
+        <w:tc>
+          <w:tcPr>
+            <w:tcW w:type="dxa" w:w="8741"/>
             <w:tcBorders>
               <w:top w:val="single" w:color="BFBFBF" w:sz="4"/>
               <w:left w:val="single" w:color="BFBFBF" w:sz="4"/>
@@ -10889,7 +11295,7 @@
         </w:tc>
         <w:tc>
           <w:tcPr>
-            <w:tcW w:type="dxa" w:w="2106"/>
+            <w:tcW w:type="dxa" w:w="1986"/>
             <w:tcBorders>
               <w:top w:val="single" w:color="BFBFBF" w:sz="4"/>
               <w:left w:val="single" w:color="BFBFBF" w:sz="4"/>
@@ -10915,7 +11321,7 @@
         </w:tc>
         <w:tc>
           <w:tcPr>
-            <w:tcW w:type="dxa" w:w="2668"/>
+            <w:tcW w:type="dxa" w:w="3313"/>
             <w:tcBorders>
               <w:top w:val="single" w:color="BFBFBF" w:sz="4"/>
               <w:left w:val="single" w:color="BFBFBF" w:sz="4"/>
@@ -10947,7 +11353,14 @@
         <w:spacing w:after="120"/>
       </w:pPr>
       <w:r>
-        <w:t xml:space="preserve">The two reviews disagree on one ownership: the duplicate "king silk sheets" campaigns.</w:t>
+        <w:rPr>
+          <w:b/>
+          <w:bCs/>
+        </w:rPr>
+        <w:t xml:space="preserve">"king silk sheets" has two campaigns.</w:t>
+      </w:r>
+      <w:r>
+        <w:t xml:space="preserve"> Review B's owner is kept: 104969852664268, live on King Black at $1.09 × 200% = $2.18 (35 clicks, 7 orders in 90 days). The duplicate "king silk sheets" target in 446556169592872 is paused.</w:t>
       </w:r>
     </w:p>
     <w:p>
@@ -10959,7 +11372,7 @@
         </w:numPr>
       </w:pPr>
       <w:r>
-        <w:t xml:space="preserve">Review A keeps 446556169592872, which has 403 clicks and 66 orders in 90 days, re-points it to King Black, and pauses 104969852664268 (seq 1508).</w:t>
+        <w:t xml:space="preserve">That campaign spent $0 in the last 14 days. It sits on Striped King Blue (0 stock) at $3.00 × 165% = $4.95, above the Silk bound.</w:t>
       </w:r>
     </w:p>
     <w:p>
@@ -10971,7 +11384,7 @@
         </w:numPr>
       </w:pPr>
       <w:r>
-        <w:t xml:space="preserve">Review B does the reverse.</w:t>
+        <w:t xml:space="preserve">Its keyword has 20 clicks and 2 orders; its 66-order history came from other keywords on a different child.</w:t>
       </w:r>
     </w:p>
     <w:p>
@@ -10983,7 +11396,7 @@
         </w:numPr>
       </w:pPr>
       <w:r>
-        <w:t xml:space="preserve">We take Review A's, to keep the campaign with the history. Review B's bulk rows for 104969852664268 are excluded.</w:t>
+        <w:t xml:space="preserve">The engine (SOP-29) and Review A's first pass had kept it. Re-enabled as it stands, it would come back at $4.95.</w:t>
       </w:r>
     </w:p>
     <w:p>
@@ -12007,7 +12420,7 @@
                 <w:sz w:val="17"/>
                 <w:szCs w:val="17"/>
               </w:rPr>
-              <w:t xml:space="preserve">Pause (keep the owner with history)</w:t>
+              <w:t xml:space="preserve">Keep enabled (104969852664268 owns the term); pause the "king silk sheets" target in 446556169592872 instead</w:t>
             </w:r>
           </w:p>
         </w:tc>
@@ -12033,7 +12446,7 @@
                 <w:sz w:val="17"/>
                 <w:szCs w:val="17"/>
               </w:rPr>
-              <w:t xml:space="preserve">A</w:t>
+              <w:t xml:space="preserve">B</w:t>
             </w:r>
           </w:p>
         </w:tc>
@@ -13330,7 +13743,7 @@
                 <w:sz w:val="17"/>
                 <w:szCs w:val="17"/>
               </w:rPr>
-              <w:t xml:space="preserve">about +$695 gross, about +$450 net of the orders they bring</w:t>
+              <w:t xml:space="preserve">about +$700 gross, about +$450 net of the orders they bring</w:t>
             </w:r>
           </w:p>
         </w:tc>
@@ -13519,10 +13932,10 @@
         </w:tblBorders>
       </w:tblPr>
       <w:tblGrid>
-        <w:gridCol w:w="3013"/>
-        <w:gridCol w:w="4520"/>
-        <w:gridCol w:w="4520"/>
-        <w:gridCol w:w="1987"/>
+        <w:gridCol w:w="2955"/>
+        <w:gridCol w:w="4433"/>
+        <w:gridCol w:w="4433"/>
+        <w:gridCol w:w="2219"/>
       </w:tblGrid>
       <w:tr>
         <w:trPr>
@@ -13530,7 +13943,7 @@
         </w:trPr>
         <w:tc>
           <w:tcPr>
-            <w:tcW w:type="dxa" w:w="3013"/>
+            <w:tcW w:type="dxa" w:w="2955"/>
             <w:tcBorders>
               <w:top w:val="single" w:color="BFBFBF" w:sz="4"/>
               <w:left w:val="single" w:color="BFBFBF" w:sz="4"/>
@@ -13560,7 +13973,7 @@
         </w:tc>
         <w:tc>
           <w:tcPr>
-            <w:tcW w:type="dxa" w:w="4520"/>
+            <w:tcW w:type="dxa" w:w="4433"/>
             <w:tcBorders>
               <w:top w:val="single" w:color="BFBFBF" w:sz="4"/>
               <w:left w:val="single" w:color="BFBFBF" w:sz="4"/>
@@ -13590,7 +14003,7 @@
         </w:tc>
         <w:tc>
           <w:tcPr>
-            <w:tcW w:type="dxa" w:w="4520"/>
+            <w:tcW w:type="dxa" w:w="4433"/>
             <w:tcBorders>
               <w:top w:val="single" w:color="BFBFBF" w:sz="4"/>
               <w:left w:val="single" w:color="BFBFBF" w:sz="4"/>
@@ -13620,7 +14033,7 @@
         </w:tc>
         <w:tc>
           <w:tcPr>
-            <w:tcW w:type="dxa" w:w="1987"/>
+            <w:tcW w:type="dxa" w:w="2219"/>
             <w:tcBorders>
               <w:top w:val="single" w:color="BFBFBF" w:sz="4"/>
               <w:left w:val="single" w:color="BFBFBF" w:sz="4"/>
@@ -13655,7 +14068,7 @@
         </w:trPr>
         <w:tc>
           <w:tcPr>
-            <w:tcW w:type="dxa" w:w="3013"/>
+            <w:tcW w:type="dxa" w:w="2955"/>
             <w:tcBorders>
               <w:top w:val="single" w:color="BFBFBF" w:sz="4"/>
               <w:left w:val="single" w:color="BFBFBF" w:sz="4"/>
@@ -13681,7 +14094,7 @@
         </w:tc>
         <w:tc>
           <w:tcPr>
-            <w:tcW w:type="dxa" w:w="4520"/>
+            <w:tcW w:type="dxa" w:w="4433"/>
             <w:tcBorders>
               <w:top w:val="single" w:color="BFBFBF" w:sz="4"/>
               <w:left w:val="single" w:color="BFBFBF" w:sz="4"/>
@@ -13707,7 +14120,7 @@
         </w:tc>
         <w:tc>
           <w:tcPr>
-            <w:tcW w:type="dxa" w:w="4520"/>
+            <w:tcW w:type="dxa" w:w="4433"/>
             <w:tcBorders>
               <w:top w:val="single" w:color="BFBFBF" w:sz="4"/>
               <w:left w:val="single" w:color="BFBFBF" w:sz="4"/>
@@ -13733,7 +14146,7 @@
         </w:tc>
         <w:tc>
           <w:tcPr>
-            <w:tcW w:type="dxa" w:w="1987"/>
+            <w:tcW w:type="dxa" w:w="2219"/>
             <w:tcBorders>
               <w:top w:val="single" w:color="BFBFBF" w:sz="4"/>
               <w:left w:val="single" w:color="BFBFBF" w:sz="4"/>
@@ -13764,7 +14177,7 @@
         </w:trPr>
         <w:tc>
           <w:tcPr>
-            <w:tcW w:type="dxa" w:w="3013"/>
+            <w:tcW w:type="dxa" w:w="2955"/>
             <w:tcBorders>
               <w:top w:val="single" w:color="BFBFBF" w:sz="4"/>
               <w:left w:val="single" w:color="BFBFBF" w:sz="4"/>
@@ -13790,7 +14203,7 @@
         </w:tc>
         <w:tc>
           <w:tcPr>
-            <w:tcW w:type="dxa" w:w="4520"/>
+            <w:tcW w:type="dxa" w:w="4433"/>
             <w:tcBorders>
               <w:top w:val="single" w:color="BFBFBF" w:sz="4"/>
               <w:left w:val="single" w:color="BFBFBF" w:sz="4"/>
@@ -13816,7 +14229,7 @@
         </w:tc>
         <w:tc>
           <w:tcPr>
-            <w:tcW w:type="dxa" w:w="4520"/>
+            <w:tcW w:type="dxa" w:w="4433"/>
             <w:tcBorders>
               <w:top w:val="single" w:color="BFBFBF" w:sz="4"/>
               <w:left w:val="single" w:color="BFBFBF" w:sz="4"/>
@@ -13842,7 +14255,7 @@
         </w:tc>
         <w:tc>
           <w:tcPr>
-            <w:tcW w:type="dxa" w:w="1987"/>
+            <w:tcW w:type="dxa" w:w="2219"/>
             <w:tcBorders>
               <w:top w:val="single" w:color="BFBFBF" w:sz="4"/>
               <w:left w:val="single" w:color="BFBFBF" w:sz="4"/>
@@ -13873,105 +14286,105 @@
         </w:trPr>
         <w:tc>
           <w:tcPr>
-            <w:tcW w:type="dxa" w:w="3013"/>
-            <w:tcBorders>
-              <w:top w:val="single" w:color="BFBFBF" w:sz="4"/>
-              <w:left w:val="single" w:color="BFBFBF" w:sz="4"/>
-              <w:bottom w:val="single" w:color="BFBFBF" w:sz="4"/>
-              <w:right w:val="single" w:color="BFBFBF" w:sz="4"/>
-            </w:tcBorders>
-            <w:tcMar>
-              <w:top w:type="dxa" w:w="60"/>
-              <w:left w:type="dxa" w:w="90"/>
-              <w:bottom w:type="dxa" w:w="60"/>
-              <w:right w:type="dxa" w:w="90"/>
-            </w:tcMar>
-          </w:tcPr>
-          <w:p>
-            <w:r>
-              <w:rPr>
-                <w:sz w:val="17"/>
-                <w:szCs w:val="17"/>
-              </w:rPr>
-              <w:t xml:space="preserve">"silk sheets"</w:t>
-            </w:r>
-          </w:p>
-        </w:tc>
-        <w:tc>
-          <w:tcPr>
-            <w:tcW w:type="dxa" w:w="4520"/>
-            <w:tcBorders>
-              <w:top w:val="single" w:color="BFBFBF" w:sz="4"/>
-              <w:left w:val="single" w:color="BFBFBF" w:sz="4"/>
-              <w:bottom w:val="single" w:color="BFBFBF" w:sz="4"/>
-              <w:right w:val="single" w:color="BFBFBF" w:sz="4"/>
-            </w:tcBorders>
-            <w:tcMar>
-              <w:top w:type="dxa" w:w="60"/>
-              <w:left w:type="dxa" w:w="90"/>
-              <w:bottom w:type="dxa" w:w="60"/>
-              <w:right w:type="dxa" w:w="90"/>
-            </w:tcMar>
-          </w:tcPr>
-          <w:p>
-            <w:r>
-              <w:rPr>
-                <w:sz w:val="17"/>
-                <w:szCs w:val="17"/>
-              </w:rPr>
-              <w:t xml:space="preserve">Biggest term (36 market purchases a day). S6 #58, S4 #28–46. S6 converts slightly better, not significantly. Queen Black margin.</w:t>
-            </w:r>
-          </w:p>
-        </w:tc>
-        <w:tc>
-          <w:tcPr>
-            <w:tcW w:type="dxa" w:w="4520"/>
-            <w:tcBorders>
-              <w:top w:val="single" w:color="BFBFBF" w:sz="4"/>
-              <w:left w:val="single" w:color="BFBFBF" w:sz="4"/>
-              <w:bottom w:val="single" w:color="BFBFBF" w:sz="4"/>
-              <w:right w:val="single" w:color="BFBFBF" w:sz="4"/>
-            </w:tcBorders>
-            <w:tcMar>
-              <w:top w:type="dxa" w:w="60"/>
-              <w:left w:type="dxa" w:w="90"/>
-              <w:bottom w:type="dxa" w:w="60"/>
-              <w:right w:type="dxa" w:w="90"/>
-            </w:tcMar>
-          </w:tcPr>
-          <w:p>
-            <w:r>
-              <w:rPr>
-                <w:sz w:val="17"/>
-                <w:szCs w:val="17"/>
-              </w:rPr>
-              <w:t xml:space="preserve">S6 test ($13 a day, 2 weeks after 12 Oct) or leave to S4</w:t>
-            </w:r>
-          </w:p>
-        </w:tc>
-        <w:tc>
-          <w:tcPr>
-            <w:tcW w:type="dxa" w:w="1987"/>
-            <w:tcBorders>
-              <w:top w:val="single" w:color="BFBFBF" w:sz="4"/>
-              <w:left w:val="single" w:color="BFBFBF" w:sz="4"/>
-              <w:bottom w:val="single" w:color="BFBFBF" w:sz="4"/>
-              <w:right w:val="single" w:color="BFBFBF" w:sz="4"/>
-            </w:tcBorders>
-            <w:tcMar>
-              <w:top w:type="dxa" w:w="60"/>
-              <w:left w:type="dxa" w:w="90"/>
-              <w:bottom w:type="dxa" w:w="60"/>
-              <w:right w:type="dxa" w:w="90"/>
-            </w:tcMar>
-          </w:tcPr>
-          <w:p>
-            <w:r>
-              <w:rPr>
-                <w:sz w:val="17"/>
-                <w:szCs w:val="17"/>
-              </w:rPr>
-              <w:t xml:space="preserve">Joseph</w:t>
+            <w:tcW w:type="dxa" w:w="2955"/>
+            <w:tcBorders>
+              <w:top w:val="single" w:color="BFBFBF" w:sz="4"/>
+              <w:left w:val="single" w:color="BFBFBF" w:sz="4"/>
+              <w:bottom w:val="single" w:color="BFBFBF" w:sz="4"/>
+              <w:right w:val="single" w:color="BFBFBF" w:sz="4"/>
+            </w:tcBorders>
+            <w:tcMar>
+              <w:top w:type="dxa" w:w="60"/>
+              <w:left w:type="dxa" w:w="90"/>
+              <w:bottom w:type="dxa" w:w="60"/>
+              <w:right w:type="dxa" w:w="90"/>
+            </w:tcMar>
+          </w:tcPr>
+          <w:p>
+            <w:r>
+              <w:rPr>
+                <w:sz w:val="17"/>
+                <w:szCs w:val="17"/>
+              </w:rPr>
+              <w:t xml:space="preserve">Engine focus list for S6 and S4</w:t>
+            </w:r>
+          </w:p>
+        </w:tc>
+        <w:tc>
+          <w:tcPr>
+            <w:tcW w:type="dxa" w:w="4433"/>
+            <w:tcBorders>
+              <w:top w:val="single" w:color="BFBFBF" w:sz="4"/>
+              <w:left w:val="single" w:color="BFBFBF" w:sz="4"/>
+              <w:bottom w:val="single" w:color="BFBFBF" w:sz="4"/>
+              <w:right w:val="single" w:color="BFBFBF" w:sz="4"/>
+            </w:tcBorders>
+            <w:tcMar>
+              <w:top w:type="dxa" w:w="60"/>
+              <w:left w:type="dxa" w:w="90"/>
+              <w:bottom w:type="dxa" w:w="60"/>
+              <w:right w:type="dxa" w:w="90"/>
+            </w:tcMar>
+          </w:tcPr>
+          <w:p>
+            <w:r>
+              <w:rPr>
+                <w:sz w:val="17"/>
+                <w:szCs w:val="17"/>
+              </w:rPr>
+              <w:t xml:space="preserve">This run’s S6 focus is Satin, Satin Queen, Satin Full and Satin Twin (the groups S4 wins); Silk and King (the groups S6 wins) are excluded, so the engine tapers S6’s best syntax</w:t>
+            </w:r>
+          </w:p>
+        </w:tc>
+        <w:tc>
+          <w:tcPr>
+            <w:tcW w:type="dxa" w:w="4433"/>
+            <w:tcBorders>
+              <w:top w:val="single" w:color="BFBFBF" w:sz="4"/>
+              <w:left w:val="single" w:color="BFBFBF" w:sz="4"/>
+              <w:bottom w:val="single" w:color="BFBFBF" w:sz="4"/>
+              <w:right w:val="single" w:color="BFBFBF" w:sz="4"/>
+            </w:tcBorders>
+            <w:tcMar>
+              <w:top w:type="dxa" w:w="60"/>
+              <w:left w:type="dxa" w:w="90"/>
+              <w:bottom w:type="dxa" w:w="60"/>
+              <w:right w:type="dxa" w:w="90"/>
+            </w:tcMar>
+          </w:tcPr>
+          <w:p>
+            <w:r>
+              <w:rPr>
+                <w:sz w:val="17"/>
+                <w:szCs w:val="17"/>
+              </w:rPr>
+              <w:t xml:space="preserve">Set S6’s focus to Silk King (plus "6 piece"); S4’s to the Satin and Queen groups</w:t>
+            </w:r>
+          </w:p>
+        </w:tc>
+        <w:tc>
+          <w:tcPr>
+            <w:tcW w:type="dxa" w:w="2219"/>
+            <w:tcBorders>
+              <w:top w:val="single" w:color="BFBFBF" w:sz="4"/>
+              <w:left w:val="single" w:color="BFBFBF" w:sz="4"/>
+              <w:bottom w:val="single" w:color="BFBFBF" w:sz="4"/>
+              <w:right w:val="single" w:color="BFBFBF" w:sz="4"/>
+            </w:tcBorders>
+            <w:tcMar>
+              <w:top w:type="dxa" w:w="60"/>
+              <w:left w:type="dxa" w:w="90"/>
+              <w:bottom w:type="dxa" w:w="60"/>
+              <w:right w:type="dxa" w:w="90"/>
+            </w:tcMar>
+          </w:tcPr>
+          <w:p>
+            <w:r>
+              <w:rPr>
+                <w:sz w:val="17"/>
+                <w:szCs w:val="17"/>
+              </w:rPr>
+              <w:t xml:space="preserve">Joseph, before the next run</w:t>
             </w:r>
           </w:p>
         </w:tc>
@@ -13982,105 +14395,105 @@
         </w:trPr>
         <w:tc>
           <w:tcPr>
-            <w:tcW w:type="dxa" w:w="3013"/>
-            <w:tcBorders>
-              <w:top w:val="single" w:color="BFBFBF" w:sz="4"/>
-              <w:left w:val="single" w:color="BFBFBF" w:sz="4"/>
-              <w:bottom w:val="single" w:color="BFBFBF" w:sz="4"/>
-              <w:right w:val="single" w:color="BFBFBF" w:sz="4"/>
-            </w:tcBorders>
-            <w:tcMar>
-              <w:top w:type="dxa" w:w="60"/>
-              <w:left w:type="dxa" w:w="90"/>
-              <w:bottom w:type="dxa" w:w="60"/>
-              <w:right w:type="dxa" w:w="90"/>
-            </w:tcMar>
-          </w:tcPr>
-          <w:p>
-            <w:r>
-              <w:rPr>
-                <w:sz w:val="17"/>
-                <w:szCs w:val="17"/>
-              </w:rPr>
-              <w:t xml:space="preserve">Five price rows above the market bound</w:t>
-            </w:r>
-          </w:p>
-        </w:tc>
-        <w:tc>
-          <w:tcPr>
-            <w:tcW w:type="dxa" w:w="4520"/>
-            <w:tcBorders>
-              <w:top w:val="single" w:color="BFBFBF" w:sz="4"/>
-              <w:left w:val="single" w:color="BFBFBF" w:sz="4"/>
-              <w:bottom w:val="single" w:color="BFBFBF" w:sz="4"/>
-              <w:right w:val="single" w:color="BFBFBF" w:sz="4"/>
-            </w:tcBorders>
-            <w:tcMar>
-              <w:top w:type="dxa" w:w="60"/>
-              <w:left w:type="dxa" w:w="90"/>
-              <w:bottom w:type="dxa" w:w="60"/>
-              <w:right w:type="dxa" w:w="90"/>
-            </w:tcMar>
-          </w:tcPr>
-          <w:p>
-            <w:r>
-              <w:rPr>
-                <w:sz w:val="17"/>
-                <w:szCs w:val="17"/>
-              </w:rPr>
-              <w:t xml:space="preserve">45/48/49/50 at $3.47 against a $2.89 bound; 110 at $2.48 against $2.30; plus 8 engine-held</w:t>
-            </w:r>
-          </w:p>
-        </w:tc>
-        <w:tc>
-          <w:tcPr>
-            <w:tcW w:type="dxa" w:w="4520"/>
-            <w:tcBorders>
-              <w:top w:val="single" w:color="BFBFBF" w:sz="4"/>
-              <w:left w:val="single" w:color="BFBFBF" w:sz="4"/>
-              <w:bottom w:val="single" w:color="BFBFBF" w:sz="4"/>
-              <w:right w:val="single" w:color="BFBFBF" w:sz="4"/>
-            </w:tcBorders>
-            <w:tcMar>
-              <w:top w:type="dxa" w:w="60"/>
-              <w:left w:type="dxa" w:w="90"/>
-              <w:bottom w:type="dxa" w:w="60"/>
-              <w:right w:type="dxa" w:w="90"/>
-            </w:tcMar>
-          </w:tcPr>
-          <w:p>
-            <w:r>
-              <w:rPr>
-                <w:sz w:val="17"/>
-                <w:szCs w:val="17"/>
-              </w:rPr>
-              <w:t xml:space="preserve">Cut to the bound unless the term is in a funded push</w:t>
-            </w:r>
-          </w:p>
-        </w:tc>
-        <w:tc>
-          <w:tcPr>
-            <w:tcW w:type="dxa" w:w="1987"/>
-            <w:tcBorders>
-              <w:top w:val="single" w:color="BFBFBF" w:sz="4"/>
-              <w:left w:val="single" w:color="BFBFBF" w:sz="4"/>
-              <w:bottom w:val="single" w:color="BFBFBF" w:sz="4"/>
-              <w:right w:val="single" w:color="BFBFBF" w:sz="4"/>
-            </w:tcBorders>
-            <w:tcMar>
-              <w:top w:type="dxa" w:w="60"/>
-              <w:left w:type="dxa" w:w="90"/>
-              <w:bottom w:type="dxa" w:w="60"/>
-              <w:right w:type="dxa" w:w="90"/>
-            </w:tcMar>
-          </w:tcPr>
-          <w:p>
-            <w:r>
-              <w:rPr>
-                <w:sz w:val="17"/>
-                <w:szCs w:val="17"/>
-              </w:rPr>
-              <w:t xml:space="preserve">Joseph, before the load</w:t>
+            <w:tcW w:type="dxa" w:w="2955"/>
+            <w:tcBorders>
+              <w:top w:val="single" w:color="BFBFBF" w:sz="4"/>
+              <w:left w:val="single" w:color="BFBFBF" w:sz="4"/>
+              <w:bottom w:val="single" w:color="BFBFBF" w:sz="4"/>
+              <w:right w:val="single" w:color="BFBFBF" w:sz="4"/>
+            </w:tcBorders>
+            <w:tcMar>
+              <w:top w:type="dxa" w:w="60"/>
+              <w:left w:type="dxa" w:w="90"/>
+              <w:bottom w:type="dxa" w:w="60"/>
+              <w:right w:type="dxa" w:w="90"/>
+            </w:tcMar>
+          </w:tcPr>
+          <w:p>
+            <w:r>
+              <w:rPr>
+                <w:sz w:val="17"/>
+                <w:szCs w:val="17"/>
+              </w:rPr>
+              <w:t xml:space="preserve">Maintenance class HARD</w:t>
+            </w:r>
+          </w:p>
+        </w:tc>
+        <w:tc>
+          <w:tcPr>
+            <w:tcW w:type="dxa" w:w="4433"/>
+            <w:tcBorders>
+              <w:top w:val="single" w:color="BFBFBF" w:sz="4"/>
+              <w:left w:val="single" w:color="BFBFBF" w:sz="4"/>
+              <w:bottom w:val="single" w:color="BFBFBF" w:sz="4"/>
+              <w:right w:val="single" w:color="BFBFBF" w:sz="4"/>
+            </w:tcBorders>
+            <w:tcMar>
+              <w:top w:type="dxa" w:w="60"/>
+              <w:left w:type="dxa" w:w="90"/>
+              <w:bottom w:type="dxa" w:w="60"/>
+              <w:right w:type="dxa" w:w="90"/>
+            </w:tcMar>
+          </w:tcPr>
+          <w:p>
+            <w:r>
+              <w:rPr>
+                <w:sz w:val="17"/>
+                <w:szCs w:val="17"/>
+              </w:rPr>
+              <w:t xml:space="preserve">The ranking-term cuts and the "king size silk sheet set" budget halving come from the "Maintenance Profit Control" canvas (operator 2026-09-24/25, −25% off the top-of-search price)</w:t>
+            </w:r>
+          </w:p>
+        </w:tc>
+        <w:tc>
+          <w:tcPr>
+            <w:tcW w:type="dxa" w:w="4433"/>
+            <w:tcBorders>
+              <w:top w:val="single" w:color="BFBFBF" w:sz="4"/>
+              <w:left w:val="single" w:color="BFBFBF" w:sz="4"/>
+              <w:bottom w:val="single" w:color="BFBFBF" w:sz="4"/>
+              <w:right w:val="single" w:color="BFBFBF" w:sz="4"/>
+            </w:tcBorders>
+            <w:tcMar>
+              <w:top w:type="dxa" w:w="60"/>
+              <w:left w:type="dxa" w:w="90"/>
+              <w:bottom w:type="dxa" w:w="60"/>
+              <w:right w:type="dxa" w:w="90"/>
+            </w:tcMar>
+          </w:tcPr>
+          <w:p>
+            <w:r>
+              <w:rPr>
+                <w:sz w:val="17"/>
+                <w:szCs w:val="17"/>
+              </w:rPr>
+              <w:t xml:space="preserve">Exempt terms at target or inside the top 20 and the owned syntax; cap steps at 25% (bids document)</w:t>
+            </w:r>
+          </w:p>
+        </w:tc>
+        <w:tc>
+          <w:tcPr>
+            <w:tcW w:type="dxa" w:w="2219"/>
+            <w:tcBorders>
+              <w:top w:val="single" w:color="BFBFBF" w:sz="4"/>
+              <w:left w:val="single" w:color="BFBFBF" w:sz="4"/>
+              <w:bottom w:val="single" w:color="BFBFBF" w:sz="4"/>
+              <w:right w:val="single" w:color="BFBFBF" w:sz="4"/>
+            </w:tcBorders>
+            <w:tcMar>
+              <w:top w:type="dxa" w:w="60"/>
+              <w:left w:type="dxa" w:w="90"/>
+              <w:bottom w:type="dxa" w:w="60"/>
+              <w:right w:type="dxa" w:w="90"/>
+            </w:tcMar>
+          </w:tcPr>
+          <w:p>
+            <w:r>
+              <w:rPr>
+                <w:sz w:val="17"/>
+                <w:szCs w:val="17"/>
+              </w:rPr>
+              <w:t xml:space="preserve">Joseph, before the next run</w:t>
             </w:r>
           </w:p>
         </w:tc>
@@ -14091,105 +14504,105 @@
         </w:trPr>
         <w:tc>
           <w:tcPr>
-            <w:tcW w:type="dxa" w:w="3013"/>
-            <w:tcBorders>
-              <w:top w:val="single" w:color="BFBFBF" w:sz="4"/>
-              <w:left w:val="single" w:color="BFBFBF" w:sz="4"/>
-              <w:bottom w:val="single" w:color="BFBFBF" w:sz="4"/>
-              <w:right w:val="single" w:color="BFBFBF" w:sz="4"/>
-            </w:tcBorders>
-            <w:tcMar>
-              <w:top w:type="dxa" w:w="60"/>
-              <w:left w:type="dxa" w:w="90"/>
-              <w:bottom w:type="dxa" w:w="60"/>
-              <w:right w:type="dxa" w:w="90"/>
-            </w:tcMar>
-          </w:tcPr>
-          <w:p>
-            <w:r>
-              <w:rPr>
-                <w:sz w:val="17"/>
-                <w:szCs w:val="17"/>
-              </w:rPr>
-              <w:t xml:space="preserve">30 Sep Lightning Deal</w:t>
-            </w:r>
-          </w:p>
-        </w:tc>
-        <w:tc>
-          <w:tcPr>
-            <w:tcW w:type="dxa" w:w="4520"/>
-            <w:tcBorders>
-              <w:top w:val="single" w:color="BFBFBF" w:sz="4"/>
-              <w:left w:val="single" w:color="BFBFBF" w:sz="4"/>
-              <w:bottom w:val="single" w:color="BFBFBF" w:sz="4"/>
-              <w:right w:val="single" w:color="BFBFBF" w:sz="4"/>
-            </w:tcBorders>
-            <w:tcMar>
-              <w:top w:type="dxa" w:w="60"/>
-              <w:left w:type="dxa" w:w="90"/>
-              <w:bottom w:type="dxa" w:w="60"/>
-              <w:right w:type="dxa" w:w="90"/>
-            </w:tcMar>
-          </w:tcPr>
-          <w:p>
-            <w:r>
-              <w:rPr>
-                <w:sz w:val="17"/>
-                <w:szCs w:val="17"/>
-              </w:rPr>
-              <w:t xml:space="preserve">Cancellation recommended; not confirmed</w:t>
-            </w:r>
-          </w:p>
-        </w:tc>
-        <w:tc>
-          <w:tcPr>
-            <w:tcW w:type="dxa" w:w="4520"/>
-            <w:tcBorders>
-              <w:top w:val="single" w:color="BFBFBF" w:sz="4"/>
-              <w:left w:val="single" w:color="BFBFBF" w:sz="4"/>
-              <w:bottom w:val="single" w:color="BFBFBF" w:sz="4"/>
-              <w:right w:val="single" w:color="BFBFBF" w:sz="4"/>
-            </w:tcBorders>
-            <w:tcMar>
-              <w:top w:type="dxa" w:w="60"/>
-              <w:left w:type="dxa" w:w="90"/>
-              <w:bottom w:type="dxa" w:w="60"/>
-              <w:right w:type="dxa" w:w="90"/>
-            </w:tcMar>
-          </w:tcPr>
-          <w:p>
-            <w:r>
-              <w:rPr>
-                <w:sz w:val="17"/>
-                <w:szCs w:val="17"/>
-              </w:rPr>
-              <w:t xml:space="preserve">Confirm in Seller Central; mark 30 Sep as a deal day if it ran</w:t>
-            </w:r>
-          </w:p>
-        </w:tc>
-        <w:tc>
-          <w:tcPr>
-            <w:tcW w:type="dxa" w:w="1987"/>
-            <w:tcBorders>
-              <w:top w:val="single" w:color="BFBFBF" w:sz="4"/>
-              <w:left w:val="single" w:color="BFBFBF" w:sz="4"/>
-              <w:bottom w:val="single" w:color="BFBFBF" w:sz="4"/>
-              <w:right w:val="single" w:color="BFBFBF" w:sz="4"/>
-            </w:tcBorders>
-            <w:tcMar>
-              <w:top w:type="dxa" w:w="60"/>
-              <w:left w:type="dxa" w:w="90"/>
-              <w:bottom w:type="dxa" w:w="60"/>
-              <w:right w:type="dxa" w:w="90"/>
-            </w:tcMar>
-          </w:tcPr>
-          <w:p>
-            <w:r>
-              <w:rPr>
-                <w:sz w:val="17"/>
-                <w:szCs w:val="17"/>
-              </w:rPr>
-              <w:t xml:space="preserve">Joseph / Umair, 1 Oct</w:t>
+            <w:tcW w:type="dxa" w:w="2955"/>
+            <w:tcBorders>
+              <w:top w:val="single" w:color="BFBFBF" w:sz="4"/>
+              <w:left w:val="single" w:color="BFBFBF" w:sz="4"/>
+              <w:bottom w:val="single" w:color="BFBFBF" w:sz="4"/>
+              <w:right w:val="single" w:color="BFBFBF" w:sz="4"/>
+            </w:tcBorders>
+            <w:tcMar>
+              <w:top w:type="dxa" w:w="60"/>
+              <w:left w:type="dxa" w:w="90"/>
+              <w:bottom w:type="dxa" w:w="60"/>
+              <w:right w:type="dxa" w:w="90"/>
+            </w:tcMar>
+          </w:tcPr>
+          <w:p>
+            <w:r>
+              <w:rPr>
+                <w:sz w:val="17"/>
+                <w:szCs w:val="17"/>
+              </w:rPr>
+              <w:t xml:space="preserve">"silk sheets"</w:t>
+            </w:r>
+          </w:p>
+        </w:tc>
+        <w:tc>
+          <w:tcPr>
+            <w:tcW w:type="dxa" w:w="4433"/>
+            <w:tcBorders>
+              <w:top w:val="single" w:color="BFBFBF" w:sz="4"/>
+              <w:left w:val="single" w:color="BFBFBF" w:sz="4"/>
+              <w:bottom w:val="single" w:color="BFBFBF" w:sz="4"/>
+              <w:right w:val="single" w:color="BFBFBF" w:sz="4"/>
+            </w:tcBorders>
+            <w:tcMar>
+              <w:top w:type="dxa" w:w="60"/>
+              <w:left w:type="dxa" w:w="90"/>
+              <w:bottom w:type="dxa" w:w="60"/>
+              <w:right w:type="dxa" w:w="90"/>
+            </w:tcMar>
+          </w:tcPr>
+          <w:p>
+            <w:r>
+              <w:rPr>
+                <w:sz w:val="17"/>
+                <w:szCs w:val="17"/>
+              </w:rPr>
+              <w:t xml:space="preserve">Biggest term (36 market purchases a day). S6 #58, S4 #28–46. S6 converts slightly better, not significantly. Queen Black margin.</w:t>
+            </w:r>
+          </w:p>
+        </w:tc>
+        <w:tc>
+          <w:tcPr>
+            <w:tcW w:type="dxa" w:w="4433"/>
+            <w:tcBorders>
+              <w:top w:val="single" w:color="BFBFBF" w:sz="4"/>
+              <w:left w:val="single" w:color="BFBFBF" w:sz="4"/>
+              <w:bottom w:val="single" w:color="BFBFBF" w:sz="4"/>
+              <w:right w:val="single" w:color="BFBFBF" w:sz="4"/>
+            </w:tcBorders>
+            <w:tcMar>
+              <w:top w:type="dxa" w:w="60"/>
+              <w:left w:type="dxa" w:w="90"/>
+              <w:bottom w:type="dxa" w:w="60"/>
+              <w:right w:type="dxa" w:w="90"/>
+            </w:tcMar>
+          </w:tcPr>
+          <w:p>
+            <w:r>
+              <w:rPr>
+                <w:sz w:val="17"/>
+                <w:szCs w:val="17"/>
+              </w:rPr>
+              <w:t xml:space="preserve">S6 test ($13 a day, 2 weeks after 12 Oct) or leave to S4</w:t>
+            </w:r>
+          </w:p>
+        </w:tc>
+        <w:tc>
+          <w:tcPr>
+            <w:tcW w:type="dxa" w:w="2219"/>
+            <w:tcBorders>
+              <w:top w:val="single" w:color="BFBFBF" w:sz="4"/>
+              <w:left w:val="single" w:color="BFBFBF" w:sz="4"/>
+              <w:bottom w:val="single" w:color="BFBFBF" w:sz="4"/>
+              <w:right w:val="single" w:color="BFBFBF" w:sz="4"/>
+            </w:tcBorders>
+            <w:tcMar>
+              <w:top w:type="dxa" w:w="60"/>
+              <w:left w:type="dxa" w:w="90"/>
+              <w:bottom w:type="dxa" w:w="60"/>
+              <w:right w:type="dxa" w:w="90"/>
+            </w:tcMar>
+          </w:tcPr>
+          <w:p>
+            <w:r>
+              <w:rPr>
+                <w:sz w:val="17"/>
+                <w:szCs w:val="17"/>
+              </w:rPr>
+              <w:t xml:space="preserve">Joseph</w:t>
             </w:r>
           </w:p>
         </w:tc>
@@ -14200,105 +14613,105 @@
         </w:trPr>
         <w:tc>
           <w:tcPr>
-            <w:tcW w:type="dxa" w:w="3013"/>
-            <w:tcBorders>
-              <w:top w:val="single" w:color="BFBFBF" w:sz="4"/>
-              <w:left w:val="single" w:color="BFBFBF" w:sz="4"/>
-              <w:bottom w:val="single" w:color="BFBFBF" w:sz="4"/>
-              <w:right w:val="single" w:color="BFBFBF" w:sz="4"/>
-            </w:tcBorders>
-            <w:tcMar>
-              <w:top w:type="dxa" w:w="60"/>
-              <w:left w:type="dxa" w:w="90"/>
-              <w:bottom w:type="dxa" w:w="60"/>
-              <w:right w:type="dxa" w:w="90"/>
-            </w:tcMar>
-          </w:tcPr>
-          <w:p>
-            <w:r>
-              <w:rPr>
-                <w:sz w:val="17"/>
-                <w:szCs w:val="17"/>
-              </w:rPr>
-              <w:t xml:space="preserve">Prime PED at about 20%</w:t>
-            </w:r>
-          </w:p>
-        </w:tc>
-        <w:tc>
-          <w:tcPr>
-            <w:tcW w:type="dxa" w:w="4520"/>
-            <w:tcBorders>
-              <w:top w:val="single" w:color="BFBFBF" w:sz="4"/>
-              <w:left w:val="single" w:color="BFBFBF" w:sz="4"/>
-              <w:bottom w:val="single" w:color="BFBFBF" w:sz="4"/>
-              <w:right w:val="single" w:color="BFBFBF" w:sz="4"/>
-            </w:tcBorders>
-            <w:tcMar>
-              <w:top w:type="dxa" w:w="60"/>
-              <w:left w:type="dxa" w:w="90"/>
-              <w:bottom w:type="dxa" w:w="60"/>
-              <w:right w:type="dxa" w:w="90"/>
-            </w:tcMar>
-          </w:tcPr>
-          <w:p>
-            <w:r>
-              <w:rPr>
-                <w:sz w:val="17"/>
-                <w:szCs w:val="17"/>
-              </w:rPr>
-              <w:t xml:space="preserve">Queen Black about −$3.48 a unit before ads; King Black about +$2.20</w:t>
-            </w:r>
-          </w:p>
-        </w:tc>
-        <w:tc>
-          <w:tcPr>
-            <w:tcW w:type="dxa" w:w="4520"/>
-            <w:tcBorders>
-              <w:top w:val="single" w:color="BFBFBF" w:sz="4"/>
-              <w:left w:val="single" w:color="BFBFBF" w:sz="4"/>
-              <w:bottom w:val="single" w:color="BFBFBF" w:sz="4"/>
-              <w:right w:val="single" w:color="BFBFBF" w:sz="4"/>
-            </w:tcBorders>
-            <w:tcMar>
-              <w:top w:type="dxa" w:w="60"/>
-              <w:left w:type="dxa" w:w="90"/>
-              <w:bottom w:type="dxa" w:w="60"/>
-              <w:right w:type="dxa" w:w="90"/>
-            </w:tcMar>
-          </w:tcPr>
-          <w:p>
-            <w:r>
-              <w:rPr>
-                <w:sz w:val="17"/>
-                <w:szCs w:val="17"/>
-              </w:rPr>
-              <w:t xml:space="preserve">Limit to children still in profit at the deal price, or skip</w:t>
-            </w:r>
-          </w:p>
-        </w:tc>
-        <w:tc>
-          <w:tcPr>
-            <w:tcW w:type="dxa" w:w="1987"/>
-            <w:tcBorders>
-              <w:top w:val="single" w:color="BFBFBF" w:sz="4"/>
-              <w:left w:val="single" w:color="BFBFBF" w:sz="4"/>
-              <w:bottom w:val="single" w:color="BFBFBF" w:sz="4"/>
-              <w:right w:val="single" w:color="BFBFBF" w:sz="4"/>
-            </w:tcBorders>
-            <w:tcMar>
-              <w:top w:type="dxa" w:w="60"/>
-              <w:left w:type="dxa" w:w="90"/>
-              <w:bottom w:type="dxa" w:w="60"/>
-              <w:right w:type="dxa" w:w="90"/>
-            </w:tcMar>
-          </w:tcPr>
-          <w:p>
-            <w:r>
-              <w:rPr>
-                <w:sz w:val="17"/>
-                <w:szCs w:val="17"/>
-              </w:rPr>
-              <w:t xml:space="preserve">Joseph / Erik, 1 Oct</w:t>
+            <w:tcW w:type="dxa" w:w="2955"/>
+            <w:tcBorders>
+              <w:top w:val="single" w:color="BFBFBF" w:sz="4"/>
+              <w:left w:val="single" w:color="BFBFBF" w:sz="4"/>
+              <w:bottom w:val="single" w:color="BFBFBF" w:sz="4"/>
+              <w:right w:val="single" w:color="BFBFBF" w:sz="4"/>
+            </w:tcBorders>
+            <w:tcMar>
+              <w:top w:type="dxa" w:w="60"/>
+              <w:left w:type="dxa" w:w="90"/>
+              <w:bottom w:type="dxa" w:w="60"/>
+              <w:right w:type="dxa" w:w="90"/>
+            </w:tcMar>
+          </w:tcPr>
+          <w:p>
+            <w:r>
+              <w:rPr>
+                <w:sz w:val="17"/>
+                <w:szCs w:val="17"/>
+              </w:rPr>
+              <w:t xml:space="preserve">Five price rows above the market bound</w:t>
+            </w:r>
+          </w:p>
+        </w:tc>
+        <w:tc>
+          <w:tcPr>
+            <w:tcW w:type="dxa" w:w="4433"/>
+            <w:tcBorders>
+              <w:top w:val="single" w:color="BFBFBF" w:sz="4"/>
+              <w:left w:val="single" w:color="BFBFBF" w:sz="4"/>
+              <w:bottom w:val="single" w:color="BFBFBF" w:sz="4"/>
+              <w:right w:val="single" w:color="BFBFBF" w:sz="4"/>
+            </w:tcBorders>
+            <w:tcMar>
+              <w:top w:type="dxa" w:w="60"/>
+              <w:left w:type="dxa" w:w="90"/>
+              <w:bottom w:type="dxa" w:w="60"/>
+              <w:right w:type="dxa" w:w="90"/>
+            </w:tcMar>
+          </w:tcPr>
+          <w:p>
+            <w:r>
+              <w:rPr>
+                <w:sz w:val="17"/>
+                <w:szCs w:val="17"/>
+              </w:rPr>
+              <w:t xml:space="preserve">45/48/49/50 at $3.47 against a $2.89 bound; 110 at $2.48 against $2.30; plus 8 engine-held</w:t>
+            </w:r>
+          </w:p>
+        </w:tc>
+        <w:tc>
+          <w:tcPr>
+            <w:tcW w:type="dxa" w:w="4433"/>
+            <w:tcBorders>
+              <w:top w:val="single" w:color="BFBFBF" w:sz="4"/>
+              <w:left w:val="single" w:color="BFBFBF" w:sz="4"/>
+              <w:bottom w:val="single" w:color="BFBFBF" w:sz="4"/>
+              <w:right w:val="single" w:color="BFBFBF" w:sz="4"/>
+            </w:tcBorders>
+            <w:tcMar>
+              <w:top w:type="dxa" w:w="60"/>
+              <w:left w:type="dxa" w:w="90"/>
+              <w:bottom w:type="dxa" w:w="60"/>
+              <w:right w:type="dxa" w:w="90"/>
+            </w:tcMar>
+          </w:tcPr>
+          <w:p>
+            <w:r>
+              <w:rPr>
+                <w:sz w:val="17"/>
+                <w:szCs w:val="17"/>
+              </w:rPr>
+              <w:t xml:space="preserve">Cut to the bound unless the term is in a funded push</w:t>
+            </w:r>
+          </w:p>
+        </w:tc>
+        <w:tc>
+          <w:tcPr>
+            <w:tcW w:type="dxa" w:w="2219"/>
+            <w:tcBorders>
+              <w:top w:val="single" w:color="BFBFBF" w:sz="4"/>
+              <w:left w:val="single" w:color="BFBFBF" w:sz="4"/>
+              <w:bottom w:val="single" w:color="BFBFBF" w:sz="4"/>
+              <w:right w:val="single" w:color="BFBFBF" w:sz="4"/>
+            </w:tcBorders>
+            <w:tcMar>
+              <w:top w:type="dxa" w:w="60"/>
+              <w:left w:type="dxa" w:w="90"/>
+              <w:bottom w:type="dxa" w:w="60"/>
+              <w:right w:type="dxa" w:w="90"/>
+            </w:tcMar>
+          </w:tcPr>
+          <w:p>
+            <w:r>
+              <w:rPr>
+                <w:sz w:val="17"/>
+                <w:szCs w:val="17"/>
+              </w:rPr>
+              <w:t xml:space="preserve">Joseph, before the load</w:t>
             </w:r>
           </w:p>
         </w:tc>
@@ -14309,105 +14722,105 @@
         </w:trPr>
         <w:tc>
           <w:tcPr>
-            <w:tcW w:type="dxa" w:w="3013"/>
-            <w:tcBorders>
-              <w:top w:val="single" w:color="BFBFBF" w:sz="4"/>
-              <w:left w:val="single" w:color="BFBFBF" w:sz="4"/>
-              <w:bottom w:val="single" w:color="BFBFBF" w:sz="4"/>
-              <w:right w:val="single" w:color="BFBFBF" w:sz="4"/>
-            </w:tcBorders>
-            <w:tcMar>
-              <w:top w:type="dxa" w:w="60"/>
-              <w:left w:type="dxa" w:w="90"/>
-              <w:bottom w:type="dxa" w:w="60"/>
-              <w:right w:type="dxa" w:w="90"/>
-            </w:tcMar>
-          </w:tcPr>
-          <w:p>
-            <w:r>
-              <w:rPr>
-                <w:sz w:val="17"/>
-                <w:szCs w:val="17"/>
-              </w:rPr>
-              <w:t xml:space="preserve">Queen Black reorder</w:t>
-            </w:r>
-          </w:p>
-        </w:tc>
-        <w:tc>
-          <w:tcPr>
-            <w:tcW w:type="dxa" w:w="4520"/>
-            <w:tcBorders>
-              <w:top w:val="single" w:color="BFBFBF" w:sz="4"/>
-              <w:left w:val="single" w:color="BFBFBF" w:sz="4"/>
-              <w:bottom w:val="single" w:color="BFBFBF" w:sz="4"/>
-              <w:right w:val="single" w:color="BFBFBF" w:sz="4"/>
-            </w:tcBorders>
-            <w:tcMar>
-              <w:top w:type="dxa" w:w="60"/>
-              <w:left w:type="dxa" w:w="90"/>
-              <w:bottom w:type="dxa" w:w="60"/>
-              <w:right w:type="dxa" w:w="90"/>
-            </w:tcMar>
-          </w:tcPr>
-          <w:p>
-            <w:r>
-              <w:rPr>
-                <w:sz w:val="17"/>
-                <w:szCs w:val="17"/>
-              </w:rPr>
-              <w:t xml:space="preserve">563 counted + 300 unshipped; out about 29 Nov (push pace) or early Jan (consolidated pace)</w:t>
-            </w:r>
-          </w:p>
-        </w:tc>
-        <w:tc>
-          <w:tcPr>
-            <w:tcW w:type="dxa" w:w="4520"/>
-            <w:tcBorders>
-              <w:top w:val="single" w:color="BFBFBF" w:sz="4"/>
-              <w:left w:val="single" w:color="BFBFBF" w:sz="4"/>
-              <w:bottom w:val="single" w:color="BFBFBF" w:sz="4"/>
-              <w:right w:val="single" w:color="BFBFBF" w:sz="4"/>
-            </w:tcBorders>
-            <w:tcMar>
-              <w:top w:type="dxa" w:w="60"/>
-              <w:left w:type="dxa" w:w="90"/>
-              <w:bottom w:type="dxa" w:w="60"/>
-              <w:right w:type="dxa" w:w="90"/>
-            </w:tcMar>
-          </w:tcPr>
-          <w:p>
-            <w:r>
-              <w:rPr>
-                <w:sz w:val="17"/>
-                <w:szCs w:val="17"/>
-              </w:rPr>
-              <w:t xml:space="preserve">Ship the 300 now; reorder 300–600 once the goal is set</w:t>
-            </w:r>
-          </w:p>
-        </w:tc>
-        <w:tc>
-          <w:tcPr>
-            <w:tcW w:type="dxa" w:w="1987"/>
-            <w:tcBorders>
-              <w:top w:val="single" w:color="BFBFBF" w:sz="4"/>
-              <w:left w:val="single" w:color="BFBFBF" w:sz="4"/>
-              <w:bottom w:val="single" w:color="BFBFBF" w:sz="4"/>
-              <w:right w:val="single" w:color="BFBFBF" w:sz="4"/>
-            </w:tcBorders>
-            <w:tcMar>
-              <w:top w:type="dxa" w:w="60"/>
-              <w:left w:type="dxa" w:w="90"/>
-              <w:bottom w:type="dxa" w:w="60"/>
-              <w:right w:type="dxa" w:w="90"/>
-            </w:tcMar>
-          </w:tcPr>
-          <w:p>
-            <w:r>
-              <w:rPr>
-                <w:sz w:val="17"/>
-                <w:szCs w:val="17"/>
-              </w:rPr>
-              <w:t xml:space="preserve">Ops, this week</w:t>
+            <w:tcW w:type="dxa" w:w="2955"/>
+            <w:tcBorders>
+              <w:top w:val="single" w:color="BFBFBF" w:sz="4"/>
+              <w:left w:val="single" w:color="BFBFBF" w:sz="4"/>
+              <w:bottom w:val="single" w:color="BFBFBF" w:sz="4"/>
+              <w:right w:val="single" w:color="BFBFBF" w:sz="4"/>
+            </w:tcBorders>
+            <w:tcMar>
+              <w:top w:type="dxa" w:w="60"/>
+              <w:left w:type="dxa" w:w="90"/>
+              <w:bottom w:type="dxa" w:w="60"/>
+              <w:right w:type="dxa" w:w="90"/>
+            </w:tcMar>
+          </w:tcPr>
+          <w:p>
+            <w:r>
+              <w:rPr>
+                <w:sz w:val="17"/>
+                <w:szCs w:val="17"/>
+              </w:rPr>
+              <w:t xml:space="preserve">30 Sep Lightning Deal</w:t>
+            </w:r>
+          </w:p>
+        </w:tc>
+        <w:tc>
+          <w:tcPr>
+            <w:tcW w:type="dxa" w:w="4433"/>
+            <w:tcBorders>
+              <w:top w:val="single" w:color="BFBFBF" w:sz="4"/>
+              <w:left w:val="single" w:color="BFBFBF" w:sz="4"/>
+              <w:bottom w:val="single" w:color="BFBFBF" w:sz="4"/>
+              <w:right w:val="single" w:color="BFBFBF" w:sz="4"/>
+            </w:tcBorders>
+            <w:tcMar>
+              <w:top w:type="dxa" w:w="60"/>
+              <w:left w:type="dxa" w:w="90"/>
+              <w:bottom w:type="dxa" w:w="60"/>
+              <w:right w:type="dxa" w:w="90"/>
+            </w:tcMar>
+          </w:tcPr>
+          <w:p>
+            <w:r>
+              <w:rPr>
+                <w:sz w:val="17"/>
+                <w:szCs w:val="17"/>
+              </w:rPr>
+              <w:t xml:space="preserve">Cancellation recommended; not confirmed</w:t>
+            </w:r>
+          </w:p>
+        </w:tc>
+        <w:tc>
+          <w:tcPr>
+            <w:tcW w:type="dxa" w:w="4433"/>
+            <w:tcBorders>
+              <w:top w:val="single" w:color="BFBFBF" w:sz="4"/>
+              <w:left w:val="single" w:color="BFBFBF" w:sz="4"/>
+              <w:bottom w:val="single" w:color="BFBFBF" w:sz="4"/>
+              <w:right w:val="single" w:color="BFBFBF" w:sz="4"/>
+            </w:tcBorders>
+            <w:tcMar>
+              <w:top w:type="dxa" w:w="60"/>
+              <w:left w:type="dxa" w:w="90"/>
+              <w:bottom w:type="dxa" w:w="60"/>
+              <w:right w:type="dxa" w:w="90"/>
+            </w:tcMar>
+          </w:tcPr>
+          <w:p>
+            <w:r>
+              <w:rPr>
+                <w:sz w:val="17"/>
+                <w:szCs w:val="17"/>
+              </w:rPr>
+              <w:t xml:space="preserve">Confirm in Seller Central; mark 30 Sep as a deal day if it ran</w:t>
+            </w:r>
+          </w:p>
+        </w:tc>
+        <w:tc>
+          <w:tcPr>
+            <w:tcW w:type="dxa" w:w="2219"/>
+            <w:tcBorders>
+              <w:top w:val="single" w:color="BFBFBF" w:sz="4"/>
+              <w:left w:val="single" w:color="BFBFBF" w:sz="4"/>
+              <w:bottom w:val="single" w:color="BFBFBF" w:sz="4"/>
+              <w:right w:val="single" w:color="BFBFBF" w:sz="4"/>
+            </w:tcBorders>
+            <w:tcMar>
+              <w:top w:type="dxa" w:w="60"/>
+              <w:left w:type="dxa" w:w="90"/>
+              <w:bottom w:type="dxa" w:w="60"/>
+              <w:right w:type="dxa" w:w="90"/>
+            </w:tcMar>
+          </w:tcPr>
+          <w:p>
+            <w:r>
+              <w:rPr>
+                <w:sz w:val="17"/>
+                <w:szCs w:val="17"/>
+              </w:rPr>
+              <w:t xml:space="preserve">Joseph / Umair, 1 Oct</w:t>
             </w:r>
           </w:p>
         </w:tc>
@@ -14418,105 +14831,105 @@
         </w:trPr>
         <w:tc>
           <w:tcPr>
-            <w:tcW w:type="dxa" w:w="3013"/>
-            <w:tcBorders>
-              <w:top w:val="single" w:color="BFBFBF" w:sz="4"/>
-              <w:left w:val="single" w:color="BFBFBF" w:sz="4"/>
-              <w:bottom w:val="single" w:color="BFBFBF" w:sz="4"/>
-              <w:right w:val="single" w:color="BFBFBF" w:sz="4"/>
-            </w:tcBorders>
-            <w:tcMar>
-              <w:top w:type="dxa" w:w="60"/>
-              <w:left w:type="dxa" w:w="90"/>
-              <w:bottom w:type="dxa" w:w="60"/>
-              <w:right w:type="dxa" w:w="90"/>
-            </w:tcMar>
-          </w:tcPr>
-          <w:p>
-            <w:r>
-              <w:rPr>
-                <w:sz w:val="17"/>
-                <w:szCs w:val="17"/>
-              </w:rPr>
-              <w:t xml:space="preserve">King Black reorder point</w:t>
-            </w:r>
-          </w:p>
-        </w:tc>
-        <w:tc>
-          <w:tcPr>
-            <w:tcW w:type="dxa" w:w="4520"/>
-            <w:tcBorders>
-              <w:top w:val="single" w:color="BFBFBF" w:sz="4"/>
-              <w:left w:val="single" w:color="BFBFBF" w:sz="4"/>
-              <w:bottom w:val="single" w:color="BFBFBF" w:sz="4"/>
-              <w:right w:val="single" w:color="BFBFBF" w:sz="4"/>
-            </w:tcBorders>
-            <w:tcMar>
-              <w:top w:type="dxa" w:w="60"/>
-              <w:left w:type="dxa" w:w="90"/>
-              <w:bottom w:type="dxa" w:w="60"/>
-              <w:right w:type="dxa" w:w="90"/>
-            </w:tcMar>
-          </w:tcPr>
-          <w:p>
-            <w:r>
-              <w:rPr>
-                <w:sz w:val="17"/>
-                <w:szCs w:val="17"/>
-              </w:rPr>
-              <w:t xml:space="preserve">808 counted; the 35-day stock-out cost the King ranks for a month</w:t>
-            </w:r>
-          </w:p>
-        </w:tc>
-        <w:tc>
-          <w:tcPr>
-            <w:tcW w:type="dxa" w:w="4520"/>
-            <w:tcBorders>
-              <w:top w:val="single" w:color="BFBFBF" w:sz="4"/>
-              <w:left w:val="single" w:color="BFBFBF" w:sz="4"/>
-              <w:bottom w:val="single" w:color="BFBFBF" w:sz="4"/>
-              <w:right w:val="single" w:color="BFBFBF" w:sz="4"/>
-            </w:tcBorders>
-            <w:tcMar>
-              <w:top w:type="dxa" w:w="60"/>
-              <w:left w:type="dxa" w:w="90"/>
-              <w:bottom w:type="dxa" w:w="60"/>
-              <w:right w:type="dxa" w:w="90"/>
-            </w:tcMar>
-          </w:tcPr>
-          <w:p>
-            <w:r>
-              <w:rPr>
-                <w:sz w:val="17"/>
-                <w:szCs w:val="17"/>
-              </w:rPr>
-              <w:t xml:space="preserve">60 days of cover at push pace through December</w:t>
-            </w:r>
-          </w:p>
-        </w:tc>
-        <w:tc>
-          <w:tcPr>
-            <w:tcW w:type="dxa" w:w="1987"/>
-            <w:tcBorders>
-              <w:top w:val="single" w:color="BFBFBF" w:sz="4"/>
-              <w:left w:val="single" w:color="BFBFBF" w:sz="4"/>
-              <w:bottom w:val="single" w:color="BFBFBF" w:sz="4"/>
-              <w:right w:val="single" w:color="BFBFBF" w:sz="4"/>
-            </w:tcBorders>
-            <w:tcMar>
-              <w:top w:type="dxa" w:w="60"/>
-              <w:left w:type="dxa" w:w="90"/>
-              <w:bottom w:type="dxa" w:w="60"/>
-              <w:right w:type="dxa" w:w="90"/>
-            </w:tcMar>
-          </w:tcPr>
-          <w:p>
-            <w:r>
-              <w:rPr>
-                <w:sz w:val="17"/>
-                <w:szCs w:val="17"/>
-              </w:rPr>
-              <w:t xml:space="preserve">Ops</w:t>
+            <w:tcW w:type="dxa" w:w="2955"/>
+            <w:tcBorders>
+              <w:top w:val="single" w:color="BFBFBF" w:sz="4"/>
+              <w:left w:val="single" w:color="BFBFBF" w:sz="4"/>
+              <w:bottom w:val="single" w:color="BFBFBF" w:sz="4"/>
+              <w:right w:val="single" w:color="BFBFBF" w:sz="4"/>
+            </w:tcBorders>
+            <w:tcMar>
+              <w:top w:type="dxa" w:w="60"/>
+              <w:left w:type="dxa" w:w="90"/>
+              <w:bottom w:type="dxa" w:w="60"/>
+              <w:right w:type="dxa" w:w="90"/>
+            </w:tcMar>
+          </w:tcPr>
+          <w:p>
+            <w:r>
+              <w:rPr>
+                <w:sz w:val="17"/>
+                <w:szCs w:val="17"/>
+              </w:rPr>
+              <w:t xml:space="preserve">Prime PED at about 20%</w:t>
+            </w:r>
+          </w:p>
+        </w:tc>
+        <w:tc>
+          <w:tcPr>
+            <w:tcW w:type="dxa" w:w="4433"/>
+            <w:tcBorders>
+              <w:top w:val="single" w:color="BFBFBF" w:sz="4"/>
+              <w:left w:val="single" w:color="BFBFBF" w:sz="4"/>
+              <w:bottom w:val="single" w:color="BFBFBF" w:sz="4"/>
+              <w:right w:val="single" w:color="BFBFBF" w:sz="4"/>
+            </w:tcBorders>
+            <w:tcMar>
+              <w:top w:type="dxa" w:w="60"/>
+              <w:left w:type="dxa" w:w="90"/>
+              <w:bottom w:type="dxa" w:w="60"/>
+              <w:right w:type="dxa" w:w="90"/>
+            </w:tcMar>
+          </w:tcPr>
+          <w:p>
+            <w:r>
+              <w:rPr>
+                <w:sz w:val="17"/>
+                <w:szCs w:val="17"/>
+              </w:rPr>
+              <w:t xml:space="preserve">Queen Black about −$3.48 a unit before ads; King Black about +$2.20</w:t>
+            </w:r>
+          </w:p>
+        </w:tc>
+        <w:tc>
+          <w:tcPr>
+            <w:tcW w:type="dxa" w:w="4433"/>
+            <w:tcBorders>
+              <w:top w:val="single" w:color="BFBFBF" w:sz="4"/>
+              <w:left w:val="single" w:color="BFBFBF" w:sz="4"/>
+              <w:bottom w:val="single" w:color="BFBFBF" w:sz="4"/>
+              <w:right w:val="single" w:color="BFBFBF" w:sz="4"/>
+            </w:tcBorders>
+            <w:tcMar>
+              <w:top w:type="dxa" w:w="60"/>
+              <w:left w:type="dxa" w:w="90"/>
+              <w:bottom w:type="dxa" w:w="60"/>
+              <w:right w:type="dxa" w:w="90"/>
+            </w:tcMar>
+          </w:tcPr>
+          <w:p>
+            <w:r>
+              <w:rPr>
+                <w:sz w:val="17"/>
+                <w:szCs w:val="17"/>
+              </w:rPr>
+              <w:t xml:space="preserve">Limit to children still in profit at the deal price, or skip</w:t>
+            </w:r>
+          </w:p>
+        </w:tc>
+        <w:tc>
+          <w:tcPr>
+            <w:tcW w:type="dxa" w:w="2219"/>
+            <w:tcBorders>
+              <w:top w:val="single" w:color="BFBFBF" w:sz="4"/>
+              <w:left w:val="single" w:color="BFBFBF" w:sz="4"/>
+              <w:bottom w:val="single" w:color="BFBFBF" w:sz="4"/>
+              <w:right w:val="single" w:color="BFBFBF" w:sz="4"/>
+            </w:tcBorders>
+            <w:tcMar>
+              <w:top w:type="dxa" w:w="60"/>
+              <w:left w:type="dxa" w:w="90"/>
+              <w:bottom w:type="dxa" w:w="60"/>
+              <w:right w:type="dxa" w:w="90"/>
+            </w:tcMar>
+          </w:tcPr>
+          <w:p>
+            <w:r>
+              <w:rPr>
+                <w:sz w:val="17"/>
+                <w:szCs w:val="17"/>
+              </w:rPr>
+              <w:t xml:space="preserve">Joseph / Erik, 1 Oct</w:t>
             </w:r>
           </w:p>
         </w:tc>
@@ -14527,105 +14940,105 @@
         </w:trPr>
         <w:tc>
           <w:tcPr>
-            <w:tcW w:type="dxa" w:w="3013"/>
-            <w:tcBorders>
-              <w:top w:val="single" w:color="BFBFBF" w:sz="4"/>
-              <w:left w:val="single" w:color="BFBFBF" w:sz="4"/>
-              <w:bottom w:val="single" w:color="BFBFBF" w:sz="4"/>
-              <w:right w:val="single" w:color="BFBFBF" w:sz="4"/>
-            </w:tcBorders>
-            <w:tcMar>
-              <w:top w:type="dxa" w:w="60"/>
-              <w:left w:type="dxa" w:w="90"/>
-              <w:bottom w:type="dxa" w:w="60"/>
-              <w:right w:type="dxa" w:w="90"/>
-            </w:tcMar>
-          </w:tcPr>
-          <w:p>
-            <w:r>
-              <w:rPr>
-                <w:sz w:val="17"/>
-                <w:szCs w:val="17"/>
-              </w:rPr>
-              <w:t xml:space="preserve">Retags 2025 / 2027</w:t>
-            </w:r>
-          </w:p>
-        </w:tc>
-        <w:tc>
-          <w:tcPr>
-            <w:tcW w:type="dxa" w:w="4520"/>
-            <w:tcBorders>
-              <w:top w:val="single" w:color="BFBFBF" w:sz="4"/>
-              <w:left w:val="single" w:color="BFBFBF" w:sz="4"/>
-              <w:bottom w:val="single" w:color="BFBFBF" w:sz="4"/>
-              <w:right w:val="single" w:color="BFBFBF" w:sz="4"/>
-            </w:tcBorders>
-            <w:tcMar>
-              <w:top w:type="dxa" w:w="60"/>
-              <w:left w:type="dxa" w:w="90"/>
-              <w:bottom w:type="dxa" w:w="60"/>
-              <w:right w:type="dxa" w:w="90"/>
-            </w:tcMar>
-          </w:tcPr>
-          <w:p>
-            <w:r>
-              <w:rPr>
-                <w:sz w:val="17"/>
-                <w:szCs w:val="17"/>
-              </w:rPr>
-              <w:t xml:space="preserve">Target ASINs B0C9SBSPDH and B0CSFTRP2X; owner unknown</w:t>
-            </w:r>
-          </w:p>
-        </w:tc>
-        <w:tc>
-          <w:tcPr>
-            <w:tcW w:type="dxa" w:w="4520"/>
-            <w:tcBorders>
-              <w:top w:val="single" w:color="BFBFBF" w:sz="4"/>
-              <w:left w:val="single" w:color="BFBFBF" w:sz="4"/>
-              <w:bottom w:val="single" w:color="BFBFBF" w:sz="4"/>
-              <w:right w:val="single" w:color="BFBFBF" w:sz="4"/>
-            </w:tcBorders>
-            <w:tcMar>
-              <w:top w:type="dxa" w:w="60"/>
-              <w:left w:type="dxa" w:w="90"/>
-              <w:bottom w:type="dxa" w:w="60"/>
-              <w:right w:type="dxa" w:w="90"/>
-            </w:tcMar>
-          </w:tcPr>
-          <w:p>
-            <w:r>
-              <w:rPr>
-                <w:sz w:val="17"/>
-                <w:szCs w:val="17"/>
-              </w:rPr>
-              <w:t xml:space="preserve">Conquest or Defensive</w:t>
-            </w:r>
-          </w:p>
-        </w:tc>
-        <w:tc>
-          <w:tcPr>
-            <w:tcW w:type="dxa" w:w="1987"/>
-            <w:tcBorders>
-              <w:top w:val="single" w:color="BFBFBF" w:sz="4"/>
-              <w:left w:val="single" w:color="BFBFBF" w:sz="4"/>
-              <w:bottom w:val="single" w:color="BFBFBF" w:sz="4"/>
-              <w:right w:val="single" w:color="BFBFBF" w:sz="4"/>
-            </w:tcBorders>
-            <w:tcMar>
-              <w:top w:type="dxa" w:w="60"/>
-              <w:left w:type="dxa" w:w="90"/>
-              <w:bottom w:type="dxa" w:w="60"/>
-              <w:right w:type="dxa" w:w="90"/>
-            </w:tcMar>
-          </w:tcPr>
-          <w:p>
-            <w:r>
-              <w:rPr>
-                <w:sz w:val="17"/>
-                <w:szCs w:val="17"/>
-              </w:rPr>
-              <w:t xml:space="preserve">Joseph</w:t>
+            <w:tcW w:type="dxa" w:w="2955"/>
+            <w:tcBorders>
+              <w:top w:val="single" w:color="BFBFBF" w:sz="4"/>
+              <w:left w:val="single" w:color="BFBFBF" w:sz="4"/>
+              <w:bottom w:val="single" w:color="BFBFBF" w:sz="4"/>
+              <w:right w:val="single" w:color="BFBFBF" w:sz="4"/>
+            </w:tcBorders>
+            <w:tcMar>
+              <w:top w:type="dxa" w:w="60"/>
+              <w:left w:type="dxa" w:w="90"/>
+              <w:bottom w:type="dxa" w:w="60"/>
+              <w:right w:type="dxa" w:w="90"/>
+            </w:tcMar>
+          </w:tcPr>
+          <w:p>
+            <w:r>
+              <w:rPr>
+                <w:sz w:val="17"/>
+                <w:szCs w:val="17"/>
+              </w:rPr>
+              <w:t xml:space="preserve">Queen Black reorder</w:t>
+            </w:r>
+          </w:p>
+        </w:tc>
+        <w:tc>
+          <w:tcPr>
+            <w:tcW w:type="dxa" w:w="4433"/>
+            <w:tcBorders>
+              <w:top w:val="single" w:color="BFBFBF" w:sz="4"/>
+              <w:left w:val="single" w:color="BFBFBF" w:sz="4"/>
+              <w:bottom w:val="single" w:color="BFBFBF" w:sz="4"/>
+              <w:right w:val="single" w:color="BFBFBF" w:sz="4"/>
+            </w:tcBorders>
+            <w:tcMar>
+              <w:top w:type="dxa" w:w="60"/>
+              <w:left w:type="dxa" w:w="90"/>
+              <w:bottom w:type="dxa" w:w="60"/>
+              <w:right w:type="dxa" w:w="90"/>
+            </w:tcMar>
+          </w:tcPr>
+          <w:p>
+            <w:r>
+              <w:rPr>
+                <w:sz w:val="17"/>
+                <w:szCs w:val="17"/>
+              </w:rPr>
+              <w:t xml:space="preserve">563 counted + 300 unshipped; out about 29 Nov (push pace) or early Jan (consolidated pace)</w:t>
+            </w:r>
+          </w:p>
+        </w:tc>
+        <w:tc>
+          <w:tcPr>
+            <w:tcW w:type="dxa" w:w="4433"/>
+            <w:tcBorders>
+              <w:top w:val="single" w:color="BFBFBF" w:sz="4"/>
+              <w:left w:val="single" w:color="BFBFBF" w:sz="4"/>
+              <w:bottom w:val="single" w:color="BFBFBF" w:sz="4"/>
+              <w:right w:val="single" w:color="BFBFBF" w:sz="4"/>
+            </w:tcBorders>
+            <w:tcMar>
+              <w:top w:type="dxa" w:w="60"/>
+              <w:left w:type="dxa" w:w="90"/>
+              <w:bottom w:type="dxa" w:w="60"/>
+              <w:right w:type="dxa" w:w="90"/>
+            </w:tcMar>
+          </w:tcPr>
+          <w:p>
+            <w:r>
+              <w:rPr>
+                <w:sz w:val="17"/>
+                <w:szCs w:val="17"/>
+              </w:rPr>
+              <w:t xml:space="preserve">Ship the 300 now; reorder 300–600 once the goal is set</w:t>
+            </w:r>
+          </w:p>
+        </w:tc>
+        <w:tc>
+          <w:tcPr>
+            <w:tcW w:type="dxa" w:w="2219"/>
+            <w:tcBorders>
+              <w:top w:val="single" w:color="BFBFBF" w:sz="4"/>
+              <w:left w:val="single" w:color="BFBFBF" w:sz="4"/>
+              <w:bottom w:val="single" w:color="BFBFBF" w:sz="4"/>
+              <w:right w:val="single" w:color="BFBFBF" w:sz="4"/>
+            </w:tcBorders>
+            <w:tcMar>
+              <w:top w:type="dxa" w:w="60"/>
+              <w:left w:type="dxa" w:w="90"/>
+              <w:bottom w:type="dxa" w:w="60"/>
+              <w:right w:type="dxa" w:w="90"/>
+            </w:tcMar>
+          </w:tcPr>
+          <w:p>
+            <w:r>
+              <w:rPr>
+                <w:sz w:val="17"/>
+                <w:szCs w:val="17"/>
+              </w:rPr>
+              <w:t xml:space="preserve">Ops, this week</w:t>
             </w:r>
           </w:p>
         </w:tc>
@@ -14636,105 +15049,105 @@
         </w:trPr>
         <w:tc>
           <w:tcPr>
-            <w:tcW w:type="dxa" w:w="3013"/>
-            <w:tcBorders>
-              <w:top w:val="single" w:color="BFBFBF" w:sz="4"/>
-              <w:left w:val="single" w:color="BFBFBF" w:sz="4"/>
-              <w:bottom w:val="single" w:color="BFBFBF" w:sz="4"/>
-              <w:right w:val="single" w:color="BFBFBF" w:sz="4"/>
-            </w:tcBorders>
-            <w:tcMar>
-              <w:top w:type="dxa" w:w="60"/>
-              <w:left w:type="dxa" w:w="90"/>
-              <w:bottom w:type="dxa" w:w="60"/>
-              <w:right w:type="dxa" w:w="90"/>
-            </w:tcMar>
-          </w:tcPr>
-          <w:p>
-            <w:r>
-              <w:rPr>
-                <w:sz w:val="17"/>
-                <w:szCs w:val="17"/>
-              </w:rPr>
-              <w:t xml:space="preserve">Settings Review B flags</w:t>
-            </w:r>
-          </w:p>
-        </w:tc>
-        <w:tc>
-          <w:tcPr>
-            <w:tcW w:type="dxa" w:w="4520"/>
-            <w:tcBorders>
-              <w:top w:val="single" w:color="BFBFBF" w:sz="4"/>
-              <w:left w:val="single" w:color="BFBFBF" w:sz="4"/>
-              <w:bottom w:val="single" w:color="BFBFBF" w:sz="4"/>
-              <w:right w:val="single" w:color="BFBFBF" w:sz="4"/>
-            </w:tcBorders>
-            <w:tcMar>
-              <w:top w:type="dxa" w:w="60"/>
-              <w:left w:type="dxa" w:w="90"/>
-              <w:bottom w:type="dxa" w:w="60"/>
-              <w:right w:type="dxa" w:w="90"/>
-            </w:tcMar>
-          </w:tcPr>
-          <w:p>
-            <w:r>
-              <w:rPr>
-                <w:sz w:val="17"/>
-                <w:szCs w:val="17"/>
-              </w:rPr>
-              <w:t xml:space="preserve">Step size −15% a week, the conversion gate, the 60-day LTSF routing cap</w:t>
-            </w:r>
-          </w:p>
-        </w:tc>
-        <w:tc>
-          <w:tcPr>
-            <w:tcW w:type="dxa" w:w="4520"/>
-            <w:tcBorders>
-              <w:top w:val="single" w:color="BFBFBF" w:sz="4"/>
-              <w:left w:val="single" w:color="BFBFBF" w:sz="4"/>
-              <w:bottom w:val="single" w:color="BFBFBF" w:sz="4"/>
-              <w:right w:val="single" w:color="BFBFBF" w:sz="4"/>
-            </w:tcBorders>
-            <w:tcMar>
-              <w:top w:type="dxa" w:w="60"/>
-              <w:left w:type="dxa" w:w="90"/>
-              <w:bottom w:type="dxa" w:w="60"/>
-              <w:right w:type="dxa" w:w="90"/>
-            </w:tcMar>
-          </w:tcPr>
-          <w:p>
-            <w:r>
-              <w:rPr>
-                <w:sz w:val="17"/>
-                <w:szCs w:val="17"/>
-              </w:rPr>
-              <w:t xml:space="preserve">Keep them for now; re-test after the listing rewrite</w:t>
-            </w:r>
-          </w:p>
-        </w:tc>
-        <w:tc>
-          <w:tcPr>
-            <w:tcW w:type="dxa" w:w="1987"/>
-            <w:tcBorders>
-              <w:top w:val="single" w:color="BFBFBF" w:sz="4"/>
-              <w:left w:val="single" w:color="BFBFBF" w:sz="4"/>
-              <w:bottom w:val="single" w:color="BFBFBF" w:sz="4"/>
-              <w:right w:val="single" w:color="BFBFBF" w:sz="4"/>
-            </w:tcBorders>
-            <w:tcMar>
-              <w:top w:type="dxa" w:w="60"/>
-              <w:left w:type="dxa" w:w="90"/>
-              <w:bottom w:type="dxa" w:w="60"/>
-              <w:right w:type="dxa" w:w="90"/>
-            </w:tcMar>
-          </w:tcPr>
-          <w:p>
-            <w:r>
-              <w:rPr>
-                <w:sz w:val="17"/>
-                <w:szCs w:val="17"/>
-              </w:rPr>
-              <w:t xml:space="preserve">Joseph</w:t>
+            <w:tcW w:type="dxa" w:w="2955"/>
+            <w:tcBorders>
+              <w:top w:val="single" w:color="BFBFBF" w:sz="4"/>
+              <w:left w:val="single" w:color="BFBFBF" w:sz="4"/>
+              <w:bottom w:val="single" w:color="BFBFBF" w:sz="4"/>
+              <w:right w:val="single" w:color="BFBFBF" w:sz="4"/>
+            </w:tcBorders>
+            <w:tcMar>
+              <w:top w:type="dxa" w:w="60"/>
+              <w:left w:type="dxa" w:w="90"/>
+              <w:bottom w:type="dxa" w:w="60"/>
+              <w:right w:type="dxa" w:w="90"/>
+            </w:tcMar>
+          </w:tcPr>
+          <w:p>
+            <w:r>
+              <w:rPr>
+                <w:sz w:val="17"/>
+                <w:szCs w:val="17"/>
+              </w:rPr>
+              <w:t xml:space="preserve">King Black reorder point</w:t>
+            </w:r>
+          </w:p>
+        </w:tc>
+        <w:tc>
+          <w:tcPr>
+            <w:tcW w:type="dxa" w:w="4433"/>
+            <w:tcBorders>
+              <w:top w:val="single" w:color="BFBFBF" w:sz="4"/>
+              <w:left w:val="single" w:color="BFBFBF" w:sz="4"/>
+              <w:bottom w:val="single" w:color="BFBFBF" w:sz="4"/>
+              <w:right w:val="single" w:color="BFBFBF" w:sz="4"/>
+            </w:tcBorders>
+            <w:tcMar>
+              <w:top w:type="dxa" w:w="60"/>
+              <w:left w:type="dxa" w:w="90"/>
+              <w:bottom w:type="dxa" w:w="60"/>
+              <w:right w:type="dxa" w:w="90"/>
+            </w:tcMar>
+          </w:tcPr>
+          <w:p>
+            <w:r>
+              <w:rPr>
+                <w:sz w:val="17"/>
+                <w:szCs w:val="17"/>
+              </w:rPr>
+              <w:t xml:space="preserve">808 counted; the 35-day stock-out cost the King ranks for a month</w:t>
+            </w:r>
+          </w:p>
+        </w:tc>
+        <w:tc>
+          <w:tcPr>
+            <w:tcW w:type="dxa" w:w="4433"/>
+            <w:tcBorders>
+              <w:top w:val="single" w:color="BFBFBF" w:sz="4"/>
+              <w:left w:val="single" w:color="BFBFBF" w:sz="4"/>
+              <w:bottom w:val="single" w:color="BFBFBF" w:sz="4"/>
+              <w:right w:val="single" w:color="BFBFBF" w:sz="4"/>
+            </w:tcBorders>
+            <w:tcMar>
+              <w:top w:type="dxa" w:w="60"/>
+              <w:left w:type="dxa" w:w="90"/>
+              <w:bottom w:type="dxa" w:w="60"/>
+              <w:right w:type="dxa" w:w="90"/>
+            </w:tcMar>
+          </w:tcPr>
+          <w:p>
+            <w:r>
+              <w:rPr>
+                <w:sz w:val="17"/>
+                <w:szCs w:val="17"/>
+              </w:rPr>
+              <w:t xml:space="preserve">60 days of cover at push pace through December</w:t>
+            </w:r>
+          </w:p>
+        </w:tc>
+        <w:tc>
+          <w:tcPr>
+            <w:tcW w:type="dxa" w:w="2219"/>
+            <w:tcBorders>
+              <w:top w:val="single" w:color="BFBFBF" w:sz="4"/>
+              <w:left w:val="single" w:color="BFBFBF" w:sz="4"/>
+              <w:bottom w:val="single" w:color="BFBFBF" w:sz="4"/>
+              <w:right w:val="single" w:color="BFBFBF" w:sz="4"/>
+            </w:tcBorders>
+            <w:tcMar>
+              <w:top w:type="dxa" w:w="60"/>
+              <w:left w:type="dxa" w:w="90"/>
+              <w:bottom w:type="dxa" w:w="60"/>
+              <w:right w:type="dxa" w:w="90"/>
+            </w:tcMar>
+          </w:tcPr>
+          <w:p>
+            <w:r>
+              <w:rPr>
+                <w:sz w:val="17"/>
+                <w:szCs w:val="17"/>
+              </w:rPr>
+              <w:t xml:space="preserve">Ops</w:t>
             </w:r>
           </w:p>
         </w:tc>
@@ -14745,7 +15158,225 @@
         </w:trPr>
         <w:tc>
           <w:tcPr>
-            <w:tcW w:type="dxa" w:w="3013"/>
+            <w:tcW w:type="dxa" w:w="2955"/>
+            <w:tcBorders>
+              <w:top w:val="single" w:color="BFBFBF" w:sz="4"/>
+              <w:left w:val="single" w:color="BFBFBF" w:sz="4"/>
+              <w:bottom w:val="single" w:color="BFBFBF" w:sz="4"/>
+              <w:right w:val="single" w:color="BFBFBF" w:sz="4"/>
+            </w:tcBorders>
+            <w:tcMar>
+              <w:top w:type="dxa" w:w="60"/>
+              <w:left w:type="dxa" w:w="90"/>
+              <w:bottom w:type="dxa" w:w="60"/>
+              <w:right w:type="dxa" w:w="90"/>
+            </w:tcMar>
+          </w:tcPr>
+          <w:p>
+            <w:r>
+              <w:rPr>
+                <w:sz w:val="17"/>
+                <w:szCs w:val="17"/>
+              </w:rPr>
+              <w:t xml:space="preserve">Retags 2025 / 2027</w:t>
+            </w:r>
+          </w:p>
+        </w:tc>
+        <w:tc>
+          <w:tcPr>
+            <w:tcW w:type="dxa" w:w="4433"/>
+            <w:tcBorders>
+              <w:top w:val="single" w:color="BFBFBF" w:sz="4"/>
+              <w:left w:val="single" w:color="BFBFBF" w:sz="4"/>
+              <w:bottom w:val="single" w:color="BFBFBF" w:sz="4"/>
+              <w:right w:val="single" w:color="BFBFBF" w:sz="4"/>
+            </w:tcBorders>
+            <w:tcMar>
+              <w:top w:type="dxa" w:w="60"/>
+              <w:left w:type="dxa" w:w="90"/>
+              <w:bottom w:type="dxa" w:w="60"/>
+              <w:right w:type="dxa" w:w="90"/>
+            </w:tcMar>
+          </w:tcPr>
+          <w:p>
+            <w:r>
+              <w:rPr>
+                <w:sz w:val="17"/>
+                <w:szCs w:val="17"/>
+              </w:rPr>
+              <w:t xml:space="preserve">Target ASINs B0C9SBSPDH and B0CSFTRP2X; owner unknown</w:t>
+            </w:r>
+          </w:p>
+        </w:tc>
+        <w:tc>
+          <w:tcPr>
+            <w:tcW w:type="dxa" w:w="4433"/>
+            <w:tcBorders>
+              <w:top w:val="single" w:color="BFBFBF" w:sz="4"/>
+              <w:left w:val="single" w:color="BFBFBF" w:sz="4"/>
+              <w:bottom w:val="single" w:color="BFBFBF" w:sz="4"/>
+              <w:right w:val="single" w:color="BFBFBF" w:sz="4"/>
+            </w:tcBorders>
+            <w:tcMar>
+              <w:top w:type="dxa" w:w="60"/>
+              <w:left w:type="dxa" w:w="90"/>
+              <w:bottom w:type="dxa" w:w="60"/>
+              <w:right w:type="dxa" w:w="90"/>
+            </w:tcMar>
+          </w:tcPr>
+          <w:p>
+            <w:r>
+              <w:rPr>
+                <w:sz w:val="17"/>
+                <w:szCs w:val="17"/>
+              </w:rPr>
+              <w:t xml:space="preserve">Conquest or Defensive</w:t>
+            </w:r>
+          </w:p>
+        </w:tc>
+        <w:tc>
+          <w:tcPr>
+            <w:tcW w:type="dxa" w:w="2219"/>
+            <w:tcBorders>
+              <w:top w:val="single" w:color="BFBFBF" w:sz="4"/>
+              <w:left w:val="single" w:color="BFBFBF" w:sz="4"/>
+              <w:bottom w:val="single" w:color="BFBFBF" w:sz="4"/>
+              <w:right w:val="single" w:color="BFBFBF" w:sz="4"/>
+            </w:tcBorders>
+            <w:tcMar>
+              <w:top w:type="dxa" w:w="60"/>
+              <w:left w:type="dxa" w:w="90"/>
+              <w:bottom w:type="dxa" w:w="60"/>
+              <w:right w:type="dxa" w:w="90"/>
+            </w:tcMar>
+          </w:tcPr>
+          <w:p>
+            <w:r>
+              <w:rPr>
+                <w:sz w:val="17"/>
+                <w:szCs w:val="17"/>
+              </w:rPr>
+              <w:t xml:space="preserve">Joseph</w:t>
+            </w:r>
+          </w:p>
+        </w:tc>
+      </w:tr>
+      <w:tr>
+        <w:trPr>
+          <w:tblHeader w:val="off"/>
+        </w:trPr>
+        <w:tc>
+          <w:tcPr>
+            <w:tcW w:type="dxa" w:w="2955"/>
+            <w:tcBorders>
+              <w:top w:val="single" w:color="BFBFBF" w:sz="4"/>
+              <w:left w:val="single" w:color="BFBFBF" w:sz="4"/>
+              <w:bottom w:val="single" w:color="BFBFBF" w:sz="4"/>
+              <w:right w:val="single" w:color="BFBFBF" w:sz="4"/>
+            </w:tcBorders>
+            <w:tcMar>
+              <w:top w:type="dxa" w:w="60"/>
+              <w:left w:type="dxa" w:w="90"/>
+              <w:bottom w:type="dxa" w:w="60"/>
+              <w:right w:type="dxa" w:w="90"/>
+            </w:tcMar>
+          </w:tcPr>
+          <w:p>
+            <w:r>
+              <w:rPr>
+                <w:sz w:val="17"/>
+                <w:szCs w:val="17"/>
+              </w:rPr>
+              <w:t xml:space="preserve">Settings Review B flags</w:t>
+            </w:r>
+          </w:p>
+        </w:tc>
+        <w:tc>
+          <w:tcPr>
+            <w:tcW w:type="dxa" w:w="4433"/>
+            <w:tcBorders>
+              <w:top w:val="single" w:color="BFBFBF" w:sz="4"/>
+              <w:left w:val="single" w:color="BFBFBF" w:sz="4"/>
+              <w:bottom w:val="single" w:color="BFBFBF" w:sz="4"/>
+              <w:right w:val="single" w:color="BFBFBF" w:sz="4"/>
+            </w:tcBorders>
+            <w:tcMar>
+              <w:top w:type="dxa" w:w="60"/>
+              <w:left w:type="dxa" w:w="90"/>
+              <w:bottom w:type="dxa" w:w="60"/>
+              <w:right w:type="dxa" w:w="90"/>
+            </w:tcMar>
+          </w:tcPr>
+          <w:p>
+            <w:r>
+              <w:rPr>
+                <w:sz w:val="17"/>
+                <w:szCs w:val="17"/>
+              </w:rPr>
+              <w:t xml:space="preserve">Step size −15% a week, the conversion gate, the 60-day LTSF routing cap</w:t>
+            </w:r>
+          </w:p>
+        </w:tc>
+        <w:tc>
+          <w:tcPr>
+            <w:tcW w:type="dxa" w:w="4433"/>
+            <w:tcBorders>
+              <w:top w:val="single" w:color="BFBFBF" w:sz="4"/>
+              <w:left w:val="single" w:color="BFBFBF" w:sz="4"/>
+              <w:bottom w:val="single" w:color="BFBFBF" w:sz="4"/>
+              <w:right w:val="single" w:color="BFBFBF" w:sz="4"/>
+            </w:tcBorders>
+            <w:tcMar>
+              <w:top w:type="dxa" w:w="60"/>
+              <w:left w:type="dxa" w:w="90"/>
+              <w:bottom w:type="dxa" w:w="60"/>
+              <w:right w:type="dxa" w:w="90"/>
+            </w:tcMar>
+          </w:tcPr>
+          <w:p>
+            <w:r>
+              <w:rPr>
+                <w:sz w:val="17"/>
+                <w:szCs w:val="17"/>
+              </w:rPr>
+              <w:t xml:space="preserve">Keep them for now; re-test after the listing rewrite</w:t>
+            </w:r>
+          </w:p>
+        </w:tc>
+        <w:tc>
+          <w:tcPr>
+            <w:tcW w:type="dxa" w:w="2219"/>
+            <w:tcBorders>
+              <w:top w:val="single" w:color="BFBFBF" w:sz="4"/>
+              <w:left w:val="single" w:color="BFBFBF" w:sz="4"/>
+              <w:bottom w:val="single" w:color="BFBFBF" w:sz="4"/>
+              <w:right w:val="single" w:color="BFBFBF" w:sz="4"/>
+            </w:tcBorders>
+            <w:tcMar>
+              <w:top w:type="dxa" w:w="60"/>
+              <w:left w:type="dxa" w:w="90"/>
+              <w:bottom w:type="dxa" w:w="60"/>
+              <w:right w:type="dxa" w:w="90"/>
+            </w:tcMar>
+          </w:tcPr>
+          <w:p>
+            <w:r>
+              <w:rPr>
+                <w:sz w:val="17"/>
+                <w:szCs w:val="17"/>
+              </w:rPr>
+              <w:t xml:space="preserve">Joseph</w:t>
+            </w:r>
+          </w:p>
+        </w:tc>
+      </w:tr>
+      <w:tr>
+        <w:trPr>
+          <w:tblHeader w:val="off"/>
+        </w:trPr>
+        <w:tc>
+          <w:tcPr>
+            <w:tcW w:type="dxa" w:w="2955"/>
             <w:tcBorders>
               <w:top w:val="single" w:color="BFBFBF" w:sz="4"/>
               <w:left w:val="single" w:color="BFBFBF" w:sz="4"/>
@@ -14771,7 +15402,7 @@
         </w:tc>
         <w:tc>
           <w:tcPr>
-            <w:tcW w:type="dxa" w:w="4520"/>
+            <w:tcW w:type="dxa" w:w="4433"/>
             <w:tcBorders>
               <w:top w:val="single" w:color="BFBFBF" w:sz="4"/>
               <w:left w:val="single" w:color="BFBFBF" w:sz="4"/>
@@ -14797,7 +15428,7 @@
         </w:tc>
         <w:tc>
           <w:tcPr>
-            <w:tcW w:type="dxa" w:w="4520"/>
+            <w:tcW w:type="dxa" w:w="4433"/>
             <w:tcBorders>
               <w:top w:val="single" w:color="BFBFBF" w:sz="4"/>
               <w:left w:val="single" w:color="BFBFBF" w:sz="4"/>
@@ -14823,7 +15454,7 @@
         </w:tc>
         <w:tc>
           <w:tcPr>
-            <w:tcW w:type="dxa" w:w="1987"/>
+            <w:tcW w:type="dxa" w:w="2219"/>
             <w:tcBorders>
               <w:top w:val="single" w:color="BFBFBF" w:sz="4"/>
               <w:left w:val="single" w:color="BFBFBF" w:sz="4"/>
@@ -15223,7 +15854,7 @@
                 <w:sz w:val="17"/>
                 <w:szCs w:val="17"/>
               </w:rPr>
-              <w:t xml:space="preserve">• 4 pauses and B's 5 duplicate pauses</w:t>
+              <w:t xml:space="preserve">• 3 pauses (2019–2021), B's 5 duplicate pauses and its duplicate "king silk sheets" target pause</w:t>
             </w:r>
           </w:p>
           <w:p>
@@ -16428,7 +17059,10 @@
           <w:b/>
           <w:bCs/>
         </w:rPr>
-        <w:t xml:space="preserve">Pricing:</w:t>
+        <w:t xml:space="preserve">Pricing: fix the maintenance class, not only the pricing code.</w:t>
+      </w:r>
+      <w:r>
+        <w:t xml:space="preserve"> The rejected cuts come from the "Maintenance Profit Control" canvas, class HARD (operator 2026-09-24/25). Change it:</w:t>
       </w:r>
     </w:p>
     <w:p>
@@ -16537,8 +17171,41 @@
         </w:rPr>
         <w:t xml:space="preserve">Ownership:</w:t>
       </w:r>
-      <w:r>
-        <w:t xml:space="preserve"> record which product owns each shared term, and apply the ownership check to revives as well as new campaigns (A). One owner per term within the product (B).</w:t>
+    </w:p>
+    <w:p>
+      <w:pPr>
+        <w:pStyle w:val="ListParagraph"/>
+        <w:numPr>
+          <w:ilvl w:val="1"/>
+          <w:numId w:val="2"/>
+        </w:numPr>
+      </w:pPr>
+      <w:r>
+        <w:t xml:space="preserve">Set each product's focus list to the groups it owns: S6 = Silk King, S4 = Satin and Queen. Today S6's focus is S4's groups.</w:t>
+      </w:r>
+    </w:p>
+    <w:p>
+      <w:pPr>
+        <w:pStyle w:val="ListParagraph"/>
+        <w:numPr>
+          <w:ilvl w:val="1"/>
+          <w:numId w:val="2"/>
+        </w:numPr>
+      </w:pPr>
+      <w:r>
+        <w:t xml:space="preserve">Apply the ownership check to revives as well as new campaigns (A).</w:t>
+      </w:r>
+    </w:p>
+    <w:p>
+      <w:pPr>
+        <w:pStyle w:val="ListParagraph"/>
+        <w:numPr>
+          <w:ilvl w:val="1"/>
+          <w:numId w:val="2"/>
+        </w:numPr>
+      </w:pPr>
+      <w:r>
+        <w:t xml:space="preserve">One owner per term within the product, chosen on live serving, child and bid, not lifetime history (B).</w:t>
       </w:r>
     </w:p>
     <w:p>
@@ -16678,8 +17345,41 @@
         </w:rPr>
         <w:t xml:space="preserve">Stock.</w:t>
       </w:r>
-      <w:r>
-        <w:t xml:space="preserve"> Queen Black: Sellerboard 29 Sep 400 sellable + 157 in transfer, against Data Dive 23 Sep 303. King Black: 736 against 258 before the receipt. Sellerboard is used.</w:t>
+    </w:p>
+    <w:p>
+      <w:pPr>
+        <w:pStyle w:val="ListParagraph"/>
+        <w:numPr>
+          <w:ilvl w:val="1"/>
+          <w:numId w:val="2"/>
+        </w:numPr>
+      </w:pPr>
+      <w:r>
+        <w:t xml:space="preserve">Queen Black: the engine's table shows 386 available. Review B counts 563 (sellable + FC transfer + inbound shipped, 29 Sep). Data Dive on 23 Sep showed 303.</w:t>
+      </w:r>
+    </w:p>
+    <w:p>
+      <w:pPr>
+        <w:pStyle w:val="ListParagraph"/>
+        <w:numPr>
+          <w:ilvl w:val="1"/>
+          <w:numId w:val="2"/>
+        </w:numPr>
+      </w:pPr>
+      <w:r>
+        <w:t xml:space="preserve">King Black: 736 against 258 before the receipt.</w:t>
+      </w:r>
+    </w:p>
+    <w:p>
+      <w:pPr>
+        <w:pStyle w:val="ListParagraph"/>
+        <w:numPr>
+          <w:ilvl w:val="1"/>
+          <w:numId w:val="2"/>
+        </w:numPr>
+      </w:pPr>
+      <w:r>
+        <w:t xml:space="preserve">Sellerboard is used.</w:t>
       </w:r>
     </w:p>
     <w:p>

</xml_diff>